<commit_message>
September Weekly Internship Journal
</commit_message>
<xml_diff>
--- a/Weekly Internship Journal.docx
+++ b/Weekly Internship Journal.docx
@@ -12,6 +12,7 @@
           <w:szCs w:val="20"/>
         </w:rPr>
       </w:pPr>
+      <w:proofErr w:type="spellStart"/>
       <w:r>
         <w:rPr>
           <w:b/>
@@ -19,7 +20,17 @@
           <w:sz w:val="20"/>
           <w:szCs w:val="20"/>
         </w:rPr>
-        <w:t>Wk 1: 31/8 – 4/9</w:t>
+        <w:t>Wk</w:t>
+      </w:r>
+      <w:proofErr w:type="spellEnd"/>
+      <w:r>
+        <w:rPr>
+          <w:b/>
+          <w:bCs/>
+          <w:sz w:val="20"/>
+          <w:szCs w:val="20"/>
+        </w:rPr>
+        <w:t xml:space="preserve"> 1: 31/8 – 4/9</w:t>
       </w:r>
     </w:p>
     <w:p>
@@ -56,105 +67,21 @@
           <w:szCs w:val="20"/>
         </w:rPr>
       </w:pPr>
-      <w:r>
-        <w:rPr>
-          <w:sz w:val="20"/>
-          <w:szCs w:val="20"/>
-        </w:rPr>
-        <w:t>CodeVision Academy</w:t>
-      </w:r>
-    </w:p>
-    <w:p>
-      <w:pPr>
-        <w:spacing w:line="240" w:lineRule="auto"/>
-        <w:rPr>
-          <w:b/>
-          <w:bCs/>
-          <w:sz w:val="20"/>
-          <w:szCs w:val="20"/>
-        </w:rPr>
-      </w:pPr>
-      <w:r>
-        <w:rPr>
-          <w:b/>
-          <w:bCs/>
-          <w:sz w:val="20"/>
-          <w:szCs w:val="20"/>
-        </w:rPr>
-        <w:t>Wk 2: 7/9 – 11/9</w:t>
-      </w:r>
-    </w:p>
-    <w:p>
-      <w:pPr>
-        <w:pStyle w:val="ListParagraph"/>
-        <w:numPr>
-          <w:ilvl w:val="0"/>
-          <w:numId w:val="2"/>
-        </w:numPr>
-        <w:spacing w:line="240" w:lineRule="auto"/>
-        <w:rPr>
-          <w:i/>
-          <w:iCs/>
-          <w:sz w:val="20"/>
-          <w:szCs w:val="20"/>
-        </w:rPr>
-      </w:pPr>
-      <w:r>
-        <w:rPr>
-          <w:i/>
-          <w:iCs/>
-          <w:sz w:val="20"/>
-          <w:szCs w:val="20"/>
-        </w:rPr>
-        <w:t>AS400 – Fundamentals [7/9]</w:t>
-      </w:r>
-    </w:p>
-    <w:p>
-      <w:pPr>
-        <w:pStyle w:val="ListParagraph"/>
-        <w:numPr>
-          <w:ilvl w:val="0"/>
-          <w:numId w:val="2"/>
-        </w:numPr>
-        <w:spacing w:line="240" w:lineRule="auto"/>
-        <w:rPr>
-          <w:i/>
-          <w:iCs/>
-          <w:sz w:val="20"/>
-          <w:szCs w:val="20"/>
-        </w:rPr>
-      </w:pPr>
-      <w:r>
-        <w:rPr>
-          <w:i/>
-          <w:iCs/>
-          <w:sz w:val="20"/>
-          <w:szCs w:val="20"/>
-        </w:rPr>
-        <w:t>Dash Mantine Components [7/9]</w:t>
-      </w:r>
-    </w:p>
-    <w:p>
-      <w:pPr>
-        <w:pStyle w:val="ListParagraph"/>
-        <w:numPr>
-          <w:ilvl w:val="0"/>
-          <w:numId w:val="2"/>
-        </w:numPr>
-        <w:spacing w:line="240" w:lineRule="auto"/>
-        <w:rPr>
-          <w:sz w:val="20"/>
-          <w:szCs w:val="20"/>
-        </w:rPr>
-      </w:pPr>
-      <w:r>
-        <w:rPr>
-          <w:b/>
-          <w:bCs/>
-          <w:sz w:val="20"/>
-          <w:szCs w:val="20"/>
-        </w:rPr>
-        <w:t>[TRAINING]</w:t>
+      <w:proofErr w:type="spellStart"/>
+      <w:r>
+        <w:rPr>
+          <w:sz w:val="20"/>
+          <w:szCs w:val="20"/>
+        </w:rPr>
+        <w:t>CodeVision</w:t>
+      </w:r>
+      <w:proofErr w:type="spellEnd"/>
+      <w:r>
+        <w:rPr>
+          <w:sz w:val="20"/>
+          <w:szCs w:val="20"/>
+        </w:rPr>
+        <w:t xml:space="preserve"> Academy</w:t>
       </w:r>
       <w:r>
         <w:rPr>
@@ -163,422 +90,6 @@
         </w:rPr>
         <w:t xml:space="preserve"> </w:t>
       </w:r>
-      <w:r>
-        <w:rPr>
-          <w:sz w:val="20"/>
-          <w:szCs w:val="20"/>
-        </w:rPr>
-        <w:t>Create web application using python Dash framework [</w:t>
-      </w:r>
-      <w:r>
-        <w:rPr>
-          <w:sz w:val="20"/>
-          <w:szCs w:val="20"/>
-        </w:rPr>
-        <w:t>8</w:t>
-      </w:r>
-      <w:r>
-        <w:rPr>
-          <w:sz w:val="20"/>
-          <w:szCs w:val="20"/>
-        </w:rPr>
-        <w:t>/9]</w:t>
-      </w:r>
-    </w:p>
-    <w:p>
-      <w:pPr>
-        <w:pStyle w:val="ListParagraph"/>
-        <w:numPr>
-          <w:ilvl w:val="0"/>
-          <w:numId w:val="2"/>
-        </w:numPr>
-        <w:spacing w:line="240" w:lineRule="auto"/>
-        <w:rPr>
-          <w:sz w:val="20"/>
-          <w:szCs w:val="20"/>
-        </w:rPr>
-      </w:pPr>
-      <w:r>
-        <w:rPr>
-          <w:sz w:val="20"/>
-          <w:szCs w:val="20"/>
-        </w:rPr>
-        <w:t>Design strategy for web page &amp; web components [</w:t>
-      </w:r>
-      <w:r>
-        <w:rPr>
-          <w:sz w:val="20"/>
-          <w:szCs w:val="20"/>
-        </w:rPr>
-        <w:t>8</w:t>
-      </w:r>
-      <w:r>
-        <w:rPr>
-          <w:sz w:val="20"/>
-          <w:szCs w:val="20"/>
-        </w:rPr>
-        <w:t>/9]</w:t>
-      </w:r>
-    </w:p>
-    <w:p>
-      <w:pPr>
-        <w:pStyle w:val="ListParagraph"/>
-        <w:numPr>
-          <w:ilvl w:val="0"/>
-          <w:numId w:val="2"/>
-        </w:numPr>
-        <w:spacing w:line="240" w:lineRule="auto"/>
-        <w:rPr>
-          <w:sz w:val="20"/>
-          <w:szCs w:val="20"/>
-        </w:rPr>
-      </w:pPr>
-      <w:r>
-        <w:rPr>
-          <w:noProof/>
-          <w:sz w:val="20"/>
-          <w:szCs w:val="20"/>
-        </w:rPr>
-        <mc:AlternateContent>
-          <mc:Choice Requires="wps">
-            <w:drawing>
-              <wp:anchor distT="0" distB="0" distL="114300" distR="114300" simplePos="0" relativeHeight="251659264" behindDoc="0" locked="0" layoutInCell="1" allowOverlap="1" wp14:anchorId="6141768E" wp14:editId="27A14AF5">
-                <wp:simplePos x="0" y="0"/>
-                <wp:positionH relativeFrom="column">
-                  <wp:posOffset>-36999</wp:posOffset>
-                </wp:positionH>
-                <wp:positionV relativeFrom="paragraph">
-                  <wp:posOffset>162277</wp:posOffset>
-                </wp:positionV>
-                <wp:extent cx="5671394" cy="2050793"/>
-                <wp:effectExtent l="0" t="0" r="24765" b="26035"/>
-                <wp:wrapNone/>
-                <wp:docPr id="768107592" name="Rectangle 2"/>
-                <wp:cNvGraphicFramePr/>
-                <a:graphic xmlns:a="http://schemas.openxmlformats.org/drawingml/2006/main">
-                  <a:graphicData uri="http://schemas.microsoft.com/office/word/2010/wordprocessingShape">
-                    <wps:wsp>
-                      <wps:cNvSpPr/>
-                      <wps:spPr>
-                        <a:xfrm>
-                          <a:off x="0" y="0"/>
-                          <a:ext cx="5671394" cy="2050793"/>
-                        </a:xfrm>
-                        <a:prstGeom prst="rect">
-                          <a:avLst/>
-                        </a:prstGeom>
-                        <a:noFill/>
-                        <a:ln>
-                          <a:solidFill>
-                            <a:schemeClr val="accent2"/>
-                          </a:solidFill>
-                        </a:ln>
-                      </wps:spPr>
-                      <wps:style>
-                        <a:lnRef idx="2">
-                          <a:schemeClr val="accent1">
-                            <a:shade val="15000"/>
-                          </a:schemeClr>
-                        </a:lnRef>
-                        <a:fillRef idx="1">
-                          <a:schemeClr val="accent1"/>
-                        </a:fillRef>
-                        <a:effectRef idx="0">
-                          <a:schemeClr val="accent1"/>
-                        </a:effectRef>
-                        <a:fontRef idx="minor">
-                          <a:schemeClr val="lt1"/>
-                        </a:fontRef>
-                      </wps:style>
-                      <wps:bodyPr rot="0" spcFirstLastPara="0" vertOverflow="overflow" horzOverflow="overflow" vert="horz" wrap="square" lIns="91440" tIns="45720" rIns="91440" bIns="45720" numCol="1" spcCol="0" rtlCol="0" fromWordArt="0" anchor="ctr" anchorCtr="0" forceAA="0" compatLnSpc="1">
-                        <a:prstTxWarp prst="textNoShape">
-                          <a:avLst/>
-                        </a:prstTxWarp>
-                        <a:noAutofit/>
-                      </wps:bodyPr>
-                    </wps:wsp>
-                  </a:graphicData>
-                </a:graphic>
-                <wp14:sizeRelV relativeFrom="margin">
-                  <wp14:pctHeight>0</wp14:pctHeight>
-                </wp14:sizeRelV>
-              </wp:anchor>
-            </w:drawing>
-          </mc:Choice>
-          <mc:Fallback>
-            <w:pict>
-              <v:rect w14:anchorId="40C4A0F8" id="Rectangle 2" o:spid="_x0000_s1026" style="position:absolute;margin-left:-2.9pt;margin-top:12.8pt;width:446.55pt;height:161.5pt;z-index:251659264;visibility:visible;mso-wrap-style:square;mso-height-percent:0;mso-wrap-distance-left:9pt;mso-wrap-distance-top:0;mso-wrap-distance-right:9pt;mso-wrap-distance-bottom:0;mso-position-horizontal:absolute;mso-position-horizontal-relative:text;mso-position-vertical:absolute;mso-position-vertical-relative:text;mso-height-percent:0;mso-height-relative:margin;v-text-anchor:middle" o:gfxdata="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" filled="f" strokecolor="#e97132 [3205]" strokeweight="1.5pt"/>
-            </w:pict>
-          </mc:Fallback>
-        </mc:AlternateContent>
-      </w:r>
-      <w:r>
-        <w:rPr>
-          <w:sz w:val="20"/>
-          <w:szCs w:val="20"/>
-        </w:rPr>
-        <w:t>[9/9]</w:t>
-      </w:r>
-    </w:p>
-    <w:p>
-      <w:pPr>
-        <w:pStyle w:val="ListParagraph"/>
-        <w:numPr>
-          <w:ilvl w:val="0"/>
-          <w:numId w:val="6"/>
-        </w:numPr>
-        <w:spacing w:line="240" w:lineRule="auto"/>
-        <w:rPr>
-          <w:sz w:val="20"/>
-          <w:szCs w:val="20"/>
-        </w:rPr>
-      </w:pPr>
-      <w:r>
-        <w:rPr>
-          <w:sz w:val="20"/>
-          <w:szCs w:val="20"/>
-        </w:rPr>
-        <w:t xml:space="preserve">Setup </w:t>
-      </w:r>
-    </w:p>
-    <w:p>
-      <w:pPr>
-        <w:spacing w:line="240" w:lineRule="auto"/>
-        <w:rPr>
-          <w:sz w:val="20"/>
-          <w:szCs w:val="20"/>
-        </w:rPr>
-      </w:pPr>
-      <w:r>
-        <w:rPr>
-          <w:sz w:val="20"/>
-          <w:szCs w:val="20"/>
-        </w:rPr>
-        <w:t xml:space="preserve">Open folder </w:t>
-      </w:r>
-      <w:r>
-        <w:rPr>
-          <w:sz w:val="20"/>
-          <w:szCs w:val="20"/>
-        </w:rPr>
-        <w:sym w:font="Wingdings" w:char="F0E0"/>
-      </w:r>
-      <w:r>
-        <w:rPr>
-          <w:sz w:val="20"/>
-          <w:szCs w:val="20"/>
-        </w:rPr>
-        <w:t xml:space="preserve"> ctrl+shift+P </w:t>
-      </w:r>
-      <w:r>
-        <w:rPr>
-          <w:sz w:val="20"/>
-          <w:szCs w:val="20"/>
-        </w:rPr>
-        <w:sym w:font="Wingdings" w:char="F0E0"/>
-      </w:r>
-      <w:r>
-        <w:rPr>
-          <w:sz w:val="20"/>
-          <w:szCs w:val="20"/>
-        </w:rPr>
-        <w:t xml:space="preserve"> &gt;terminal: select default profile </w:t>
-      </w:r>
-      <w:r>
-        <w:rPr>
-          <w:sz w:val="20"/>
-          <w:szCs w:val="20"/>
-        </w:rPr>
-        <w:sym w:font="Wingdings" w:char="F0E0"/>
-      </w:r>
-      <w:r>
-        <w:rPr>
-          <w:sz w:val="20"/>
-          <w:szCs w:val="20"/>
-        </w:rPr>
-        <w:t xml:space="preserve"> save file as test.py </w:t>
-      </w:r>
-    </w:p>
-    <w:p>
-      <w:pPr>
-        <w:pStyle w:val="ListParagraph"/>
-        <w:numPr>
-          <w:ilvl w:val="0"/>
-          <w:numId w:val="5"/>
-        </w:numPr>
-        <w:spacing w:line="240" w:lineRule="auto"/>
-        <w:rPr>
-          <w:sz w:val="20"/>
-          <w:szCs w:val="20"/>
-        </w:rPr>
-      </w:pPr>
-      <w:r>
-        <w:rPr>
-          <w:sz w:val="20"/>
-          <w:szCs w:val="20"/>
-        </w:rPr>
-        <w:t>Create virtual environment</w:t>
-      </w:r>
-    </w:p>
-    <w:p>
-      <w:pPr>
-        <w:spacing w:line="240" w:lineRule="auto"/>
-        <w:rPr>
-          <w:sz w:val="20"/>
-          <w:szCs w:val="20"/>
-        </w:rPr>
-      </w:pPr>
-      <w:r>
-        <w:rPr>
-          <w:sz w:val="20"/>
-          <w:szCs w:val="20"/>
-        </w:rPr>
-        <w:t xml:space="preserve">click lower right </w:t>
-      </w:r>
-      <w:r>
-        <w:rPr>
-          <w:sz w:val="20"/>
-          <w:szCs w:val="20"/>
-        </w:rPr>
-        <w:sym w:font="Wingdings" w:char="F0E0"/>
-      </w:r>
-      <w:r>
-        <w:rPr>
-          <w:sz w:val="20"/>
-          <w:szCs w:val="20"/>
-        </w:rPr>
-        <w:t xml:space="preserve"> + create virtual environment </w:t>
-      </w:r>
-      <w:r>
-        <w:rPr>
-          <w:sz w:val="20"/>
-          <w:szCs w:val="20"/>
-        </w:rPr>
-        <w:sym w:font="Wingdings" w:char="F0E0"/>
-      </w:r>
-      <w:r>
-        <w:rPr>
-          <w:sz w:val="20"/>
-          <w:szCs w:val="20"/>
-        </w:rPr>
-        <w:t xml:space="preserve"> .venv (packages will be installed here)</w:t>
-      </w:r>
-    </w:p>
-    <w:p>
-      <w:pPr>
-        <w:pStyle w:val="ListParagraph"/>
-        <w:numPr>
-          <w:ilvl w:val="0"/>
-          <w:numId w:val="4"/>
-        </w:numPr>
-        <w:spacing w:line="240" w:lineRule="auto"/>
-        <w:rPr>
-          <w:sz w:val="20"/>
-          <w:szCs w:val="20"/>
-        </w:rPr>
-      </w:pPr>
-      <w:r>
-        <w:rPr>
-          <w:sz w:val="20"/>
-          <w:szCs w:val="20"/>
-        </w:rPr>
-        <w:t>Install packages</w:t>
-      </w:r>
-    </w:p>
-    <w:p>
-      <w:pPr>
-        <w:spacing w:line="240" w:lineRule="auto"/>
-        <w:rPr>
-          <w:sz w:val="20"/>
-          <w:szCs w:val="20"/>
-        </w:rPr>
-      </w:pPr>
-      <w:r>
-        <w:rPr>
-          <w:sz w:val="20"/>
-          <w:szCs w:val="20"/>
-        </w:rPr>
-        <w:t xml:space="preserve">.venv </w:t>
-      </w:r>
-      <w:r>
-        <w:rPr>
-          <w:sz w:val="20"/>
-          <w:szCs w:val="20"/>
-        </w:rPr>
-        <w:sym w:font="Wingdings" w:char="F0E0"/>
-      </w:r>
-      <w:r>
-        <w:rPr>
-          <w:sz w:val="20"/>
-          <w:szCs w:val="20"/>
-        </w:rPr>
-        <w:t xml:space="preserve"> Scripts </w:t>
-      </w:r>
-      <w:r>
-        <w:rPr>
-          <w:sz w:val="20"/>
-          <w:szCs w:val="20"/>
-        </w:rPr>
-        <w:sym w:font="Wingdings" w:char="F0E0"/>
-      </w:r>
-      <w:r>
-        <w:rPr>
-          <w:sz w:val="20"/>
-          <w:szCs w:val="20"/>
-        </w:rPr>
-        <w:t xml:space="preserve"> activate.bat </w:t>
-      </w:r>
-      <w:r>
-        <w:rPr>
-          <w:sz w:val="20"/>
-          <w:szCs w:val="20"/>
-        </w:rPr>
-        <w:sym w:font="Wingdings" w:char="F0E0"/>
-      </w:r>
-      <w:r>
-        <w:rPr>
-          <w:sz w:val="20"/>
-          <w:szCs w:val="20"/>
-        </w:rPr>
-        <w:t xml:space="preserve"> right click &amp; copy-paste path into terminal </w:t>
-      </w:r>
-      <w:r>
-        <w:rPr>
-          <w:sz w:val="20"/>
-          <w:szCs w:val="20"/>
-        </w:rPr>
-        <w:sym w:font="Wingdings" w:char="F0E0"/>
-      </w:r>
-      <w:r>
-        <w:rPr>
-          <w:sz w:val="20"/>
-          <w:szCs w:val="20"/>
-        </w:rPr>
-        <w:t xml:space="preserve"> pip install --trusted-host pypi.org --trusted-host pypi.python.org --trusted-host files.pythonhosted.org dash </w:t>
-      </w:r>
-      <w:r>
-        <w:rPr>
-          <w:sz w:val="20"/>
-          <w:szCs w:val="20"/>
-        </w:rPr>
-        <w:sym w:font="Wingdings" w:char="F0E0"/>
-      </w:r>
-      <w:r>
-        <w:rPr>
-          <w:sz w:val="20"/>
-          <w:szCs w:val="20"/>
-        </w:rPr>
-        <w:t xml:space="preserve"> dash-mantine-components</w:t>
-      </w:r>
-    </w:p>
-    <w:p>
-      <w:pPr>
-        <w:spacing w:line="240" w:lineRule="auto"/>
-        <w:rPr>
-          <w:sz w:val="20"/>
-          <w:szCs w:val="20"/>
-        </w:rPr>
-      </w:pPr>
       <w:hyperlink r:id="rId7" w:history="1">
         <w:r>
           <w:rPr>
@@ -586,9 +97,47 @@
             <w:sz w:val="20"/>
             <w:szCs w:val="20"/>
           </w:rPr>
-          <w:t>web_server_complete.py</w:t>
+          <w:t>https://www.codevision-academy.com/intro.html</w:t>
         </w:r>
       </w:hyperlink>
+      <w:r>
+        <w:rPr>
+          <w:sz w:val="20"/>
+          <w:szCs w:val="20"/>
+        </w:rPr>
+        <w:t xml:space="preserve"> </w:t>
+      </w:r>
+    </w:p>
+    <w:p>
+      <w:pPr>
+        <w:spacing w:line="240" w:lineRule="auto"/>
+        <w:rPr>
+          <w:b/>
+          <w:bCs/>
+          <w:sz w:val="20"/>
+          <w:szCs w:val="20"/>
+        </w:rPr>
+      </w:pPr>
+      <w:proofErr w:type="spellStart"/>
+      <w:r>
+        <w:rPr>
+          <w:b/>
+          <w:bCs/>
+          <w:sz w:val="20"/>
+          <w:szCs w:val="20"/>
+        </w:rPr>
+        <w:t>Wk</w:t>
+      </w:r>
+      <w:proofErr w:type="spellEnd"/>
+      <w:r>
+        <w:rPr>
+          <w:b/>
+          <w:bCs/>
+          <w:sz w:val="20"/>
+          <w:szCs w:val="20"/>
+        </w:rPr>
+        <w:t xml:space="preserve"> 2: 7/9 – 11/9</w:t>
+      </w:r>
     </w:p>
     <w:p>
       <w:pPr>
@@ -612,7 +161,7 @@
           <w:sz w:val="20"/>
           <w:szCs w:val="20"/>
         </w:rPr>
-        <w:t>ATM SGS TBill Bond Functional Specs [9/9]</w:t>
+        <w:t>AS400 – Fundamentals [7/9]</w:t>
       </w:r>
     </w:p>
     <w:p>
@@ -637,7 +186,66 @@
           <w:sz w:val="20"/>
           <w:szCs w:val="20"/>
         </w:rPr>
-        <w:t>ACO System v1 [10/9]</w:t>
+        <w:t xml:space="preserve">Dash </w:t>
+      </w:r>
+      <w:proofErr w:type="spellStart"/>
+      <w:r>
+        <w:rPr>
+          <w:i/>
+          <w:iCs/>
+          <w:sz w:val="20"/>
+          <w:szCs w:val="20"/>
+        </w:rPr>
+        <w:t>Mantine</w:t>
+      </w:r>
+      <w:proofErr w:type="spellEnd"/>
+      <w:r>
+        <w:rPr>
+          <w:i/>
+          <w:iCs/>
+          <w:sz w:val="20"/>
+          <w:szCs w:val="20"/>
+        </w:rPr>
+        <w:t xml:space="preserve"> Components</w:t>
+      </w:r>
+      <w:r>
+        <w:rPr>
+          <w:i/>
+          <w:iCs/>
+          <w:sz w:val="20"/>
+          <w:szCs w:val="20"/>
+        </w:rPr>
+        <w:t xml:space="preserve"> </w:t>
+      </w:r>
+      <w:hyperlink r:id="rId8" w:history="1">
+        <w:r>
+          <w:rPr>
+            <w:rStyle w:val="Hyperlink"/>
+            <w:i/>
+            <w:iCs/>
+            <w:sz w:val="20"/>
+            <w:szCs w:val="20"/>
+          </w:rPr>
+          <w:t>https://www.dash-mantine-components.com/</w:t>
+        </w:r>
+      </w:hyperlink>
+      <w:r>
+        <w:rPr>
+          <w:i/>
+          <w:iCs/>
+          <w:sz w:val="20"/>
+          <w:szCs w:val="20"/>
+        </w:rPr>
+        <w:t xml:space="preserve">  </w:t>
+      </w:r>
+      <w:r>
+        <w:rPr>
+          <w:i/>
+          <w:iCs/>
+          <w:sz w:val="20"/>
+          <w:szCs w:val="20"/>
+        </w:rPr>
+        <w:t>[7/9]</w:t>
       </w:r>
     </w:p>
     <w:p>
@@ -655,26 +263,40 @@
       </w:pPr>
       <w:r>
         <w:rPr>
-          <w:sz w:val="20"/>
-          <w:szCs w:val="20"/>
-        </w:rPr>
-        <w:t>Prompt generation - For ACO Process Extraction</w:t>
-      </w:r>
-      <w:r>
-        <w:rPr>
-          <w:sz w:val="20"/>
-          <w:szCs w:val="20"/>
-        </w:rPr>
-        <w:t xml:space="preserve"> [10/9]</w:t>
-      </w:r>
-      <w:r>
-        <w:rPr>
-          <w:rFonts w:cs="Arial"/>
-          <w:kern w:val="0"/>
+          <w:b/>
+          <w:bCs/>
+          <w:sz w:val="20"/>
+          <w:szCs w:val="20"/>
+        </w:rPr>
+        <w:t>[TRAINING]</w:t>
+      </w:r>
+      <w:r>
+        <w:rPr>
           <w:sz w:val="20"/>
           <w:szCs w:val="20"/>
         </w:rPr>
         <w:t xml:space="preserve"> </w:t>
+      </w:r>
+      <w:r>
+        <w:rPr>
+          <w:sz w:val="20"/>
+          <w:szCs w:val="20"/>
+        </w:rPr>
+        <w:t>Create web application using python Dash framework [</w:t>
+      </w:r>
+      <w:r>
+        <w:rPr>
+          <w:sz w:val="20"/>
+          <w:szCs w:val="20"/>
+        </w:rPr>
+        <w:t>8</w:t>
+      </w:r>
+      <w:r>
+        <w:rPr>
+          <w:sz w:val="20"/>
+          <w:szCs w:val="20"/>
+        </w:rPr>
+        <w:t>/9]</w:t>
       </w:r>
     </w:p>
     <w:p>
@@ -692,6 +314,226 @@
       </w:pPr>
       <w:r>
         <w:rPr>
+          <w:sz w:val="20"/>
+          <w:szCs w:val="20"/>
+        </w:rPr>
+        <w:t>Design strategy for web page &amp; web components [</w:t>
+      </w:r>
+      <w:r>
+        <w:rPr>
+          <w:sz w:val="20"/>
+          <w:szCs w:val="20"/>
+        </w:rPr>
+        <w:t>8</w:t>
+      </w:r>
+      <w:r>
+        <w:rPr>
+          <w:sz w:val="20"/>
+          <w:szCs w:val="20"/>
+        </w:rPr>
+        <w:t>/9]</w:t>
+      </w:r>
+    </w:p>
+    <w:p>
+      <w:pPr>
+        <w:pStyle w:val="ListParagraph"/>
+        <w:numPr>
+          <w:ilvl w:val="0"/>
+          <w:numId w:val="2"/>
+        </w:numPr>
+        <w:spacing w:line="240" w:lineRule="auto"/>
+        <w:rPr>
+          <w:i/>
+          <w:iCs/>
+          <w:sz w:val="20"/>
+          <w:szCs w:val="20"/>
+        </w:rPr>
+      </w:pPr>
+      <w:r>
+        <w:rPr>
+          <w:i/>
+          <w:iCs/>
+          <w:sz w:val="20"/>
+          <w:szCs w:val="20"/>
+        </w:rPr>
+        <w:t xml:space="preserve">ATM SGS </w:t>
+      </w:r>
+      <w:proofErr w:type="spellStart"/>
+      <w:r>
+        <w:rPr>
+          <w:i/>
+          <w:iCs/>
+          <w:sz w:val="20"/>
+          <w:szCs w:val="20"/>
+        </w:rPr>
+        <w:t>TBill</w:t>
+      </w:r>
+      <w:proofErr w:type="spellEnd"/>
+      <w:r>
+        <w:rPr>
+          <w:i/>
+          <w:iCs/>
+          <w:sz w:val="20"/>
+          <w:szCs w:val="20"/>
+        </w:rPr>
+        <w:t xml:space="preserve"> Bond Functional Specs [9/9]</w:t>
+      </w:r>
+    </w:p>
+    <w:p>
+      <w:pPr>
+        <w:pStyle w:val="ListParagraph"/>
+        <w:numPr>
+          <w:ilvl w:val="1"/>
+          <w:numId w:val="12"/>
+        </w:numPr>
+        <w:spacing w:line="240" w:lineRule="auto"/>
+        <w:rPr>
+          <w:i/>
+          <w:iCs/>
+          <w:sz w:val="20"/>
+          <w:szCs w:val="20"/>
+        </w:rPr>
+      </w:pPr>
+      <w:r>
+        <w:rPr>
+          <w:sz w:val="20"/>
+          <w:szCs w:val="20"/>
+        </w:rPr>
+        <w:t xml:space="preserve">Read </w:t>
+      </w:r>
+      <w:proofErr w:type="gramStart"/>
+      <w:r>
+        <w:rPr>
+          <w:sz w:val="20"/>
+          <w:szCs w:val="20"/>
+        </w:rPr>
+        <w:t>thru</w:t>
+      </w:r>
+      <w:proofErr w:type="gramEnd"/>
+      <w:r>
+        <w:rPr>
+          <w:sz w:val="20"/>
+          <w:szCs w:val="20"/>
+        </w:rPr>
+        <w:t xml:space="preserve"> the doc &amp; took down own notes</w:t>
+      </w:r>
+    </w:p>
+    <w:p>
+      <w:pPr>
+        <w:pStyle w:val="ListParagraph"/>
+        <w:numPr>
+          <w:ilvl w:val="0"/>
+          <w:numId w:val="2"/>
+        </w:numPr>
+        <w:spacing w:line="240" w:lineRule="auto"/>
+        <w:rPr>
+          <w:i/>
+          <w:iCs/>
+          <w:sz w:val="20"/>
+          <w:szCs w:val="20"/>
+        </w:rPr>
+      </w:pPr>
+      <w:r>
+        <w:rPr>
+          <w:i/>
+          <w:iCs/>
+          <w:sz w:val="20"/>
+          <w:szCs w:val="20"/>
+        </w:rPr>
+        <w:t>ACO System v1 [10/9]</w:t>
+      </w:r>
+    </w:p>
+    <w:p>
+      <w:pPr>
+        <w:pStyle w:val="ListParagraph"/>
+        <w:numPr>
+          <w:ilvl w:val="1"/>
+          <w:numId w:val="11"/>
+        </w:numPr>
+        <w:spacing w:line="240" w:lineRule="auto"/>
+        <w:rPr>
+          <w:i/>
+          <w:iCs/>
+          <w:sz w:val="20"/>
+          <w:szCs w:val="20"/>
+        </w:rPr>
+      </w:pPr>
+      <w:r>
+        <w:rPr>
+          <w:sz w:val="20"/>
+          <w:szCs w:val="20"/>
+        </w:rPr>
+        <w:t xml:space="preserve">Read </w:t>
+      </w:r>
+      <w:proofErr w:type="gramStart"/>
+      <w:r>
+        <w:rPr>
+          <w:sz w:val="20"/>
+          <w:szCs w:val="20"/>
+        </w:rPr>
+        <w:t>thru</w:t>
+      </w:r>
+      <w:proofErr w:type="gramEnd"/>
+      <w:r>
+        <w:rPr>
+          <w:sz w:val="20"/>
+          <w:szCs w:val="20"/>
+        </w:rPr>
+        <w:t xml:space="preserve"> the doc &amp; took down own notes</w:t>
+      </w:r>
+    </w:p>
+    <w:p>
+      <w:pPr>
+        <w:pStyle w:val="ListParagraph"/>
+        <w:numPr>
+          <w:ilvl w:val="0"/>
+          <w:numId w:val="2"/>
+        </w:numPr>
+        <w:spacing w:line="240" w:lineRule="auto"/>
+        <w:rPr>
+          <w:sz w:val="20"/>
+          <w:szCs w:val="20"/>
+        </w:rPr>
+      </w:pPr>
+      <w:r>
+        <w:rPr>
+          <w:sz w:val="20"/>
+          <w:szCs w:val="20"/>
+        </w:rPr>
+        <w:t>Prompt generation - For ACO Process Extraction</w:t>
+      </w:r>
+      <w:r>
+        <w:rPr>
+          <w:sz w:val="20"/>
+          <w:szCs w:val="20"/>
+        </w:rPr>
+        <w:t xml:space="preserve"> [10/9]</w:t>
+      </w:r>
+      <w:r>
+        <w:rPr>
+          <w:rFonts w:cs="Arial"/>
+          <w:kern w:val="0"/>
+          <w:sz w:val="20"/>
+          <w:szCs w:val="20"/>
+        </w:rPr>
+        <w:t xml:space="preserve"> </w:t>
+      </w:r>
+    </w:p>
+    <w:p>
+      <w:pPr>
+        <w:pStyle w:val="ListParagraph"/>
+        <w:numPr>
+          <w:ilvl w:val="0"/>
+          <w:numId w:val="2"/>
+        </w:numPr>
+        <w:spacing w:line="240" w:lineRule="auto"/>
+        <w:rPr>
+          <w:sz w:val="20"/>
+          <w:szCs w:val="20"/>
+        </w:rPr>
+      </w:pPr>
+      <w:r>
+        <w:rPr>
           <w:b/>
           <w:bCs/>
           <w:sz w:val="20"/>
@@ -704,14 +546,7 @@
           <w:sz w:val="20"/>
           <w:szCs w:val="20"/>
         </w:rPr>
-        <w:t xml:space="preserve"> </w:t>
-      </w:r>
-      <w:r>
-        <w:rPr>
-          <w:sz w:val="20"/>
-          <w:szCs w:val="20"/>
-        </w:rPr>
-        <w:t>Creating</w:t>
+        <w:t xml:space="preserve"> Creating</w:t>
       </w:r>
       <w:r>
         <w:rPr>
@@ -738,6 +573,7 @@
           <w:szCs w:val="20"/>
         </w:rPr>
       </w:pPr>
+      <w:proofErr w:type="spellStart"/>
       <w:r>
         <w:rPr>
           <w:b/>
@@ -745,7 +581,17 @@
           <w:sz w:val="20"/>
           <w:szCs w:val="20"/>
         </w:rPr>
-        <w:t>Wk 3: 14/9 – 18/9</w:t>
+        <w:t>Wk</w:t>
+      </w:r>
+      <w:proofErr w:type="spellEnd"/>
+      <w:r>
+        <w:rPr>
+          <w:b/>
+          <w:bCs/>
+          <w:sz w:val="20"/>
+          <w:szCs w:val="20"/>
+        </w:rPr>
+        <w:t xml:space="preserve"> 3: 14/9 – 18/9</w:t>
       </w:r>
     </w:p>
     <w:p>
@@ -784,35 +630,44 @@
           <w:sz w:val="20"/>
           <w:szCs w:val="20"/>
         </w:rPr>
+        <w:t xml:space="preserve"> Adding</w:t>
+      </w:r>
+      <w:r>
+        <w:rPr>
+          <w:sz w:val="20"/>
+          <w:szCs w:val="20"/>
+        </w:rPr>
+        <w:t xml:space="preserve"> Database Access to Web </w:t>
+      </w:r>
+      <w:r>
+        <w:rPr>
+          <w:sz w:val="20"/>
+          <w:szCs w:val="20"/>
+        </w:rPr>
+        <w:t>Applications</w:t>
+      </w:r>
+      <w:r>
+        <w:rPr>
+          <w:sz w:val="20"/>
+          <w:szCs w:val="20"/>
+        </w:rPr>
         <w:t xml:space="preserve"> </w:t>
       </w:r>
-      <w:r>
-        <w:rPr>
-          <w:sz w:val="20"/>
-          <w:szCs w:val="20"/>
-        </w:rPr>
-        <w:t>Adding</w:t>
-      </w:r>
-      <w:r>
-        <w:rPr>
-          <w:sz w:val="20"/>
-          <w:szCs w:val="20"/>
-        </w:rPr>
-        <w:t xml:space="preserve"> Database Access to Web </w:t>
-      </w:r>
-      <w:r>
-        <w:rPr>
-          <w:sz w:val="20"/>
-          <w:szCs w:val="20"/>
-        </w:rPr>
-        <w:t>Applications</w:t>
-      </w:r>
-      <w:r>
-        <w:rPr>
-          <w:sz w:val="20"/>
-          <w:szCs w:val="20"/>
-        </w:rPr>
-        <w:t xml:space="preserve"> To </w:t>
+      <w:proofErr w:type="gramStart"/>
+      <w:r>
+        <w:rPr>
+          <w:sz w:val="20"/>
+          <w:szCs w:val="20"/>
+        </w:rPr>
+        <w:t>To</w:t>
+      </w:r>
+      <w:proofErr w:type="gramEnd"/>
+      <w:r>
+        <w:rPr>
+          <w:sz w:val="20"/>
+          <w:szCs w:val="20"/>
+        </w:rPr>
+        <w:t xml:space="preserve"> </w:t>
       </w:r>
       <w:r>
         <w:rPr>
@@ -861,7 +716,23 @@
           <w:sz w:val="20"/>
           <w:szCs w:val="20"/>
         </w:rPr>
-        <w:t>Create sth w 2 tables (foreign keys)</w:t>
+        <w:t xml:space="preserve">Create </w:t>
+      </w:r>
+      <w:proofErr w:type="spellStart"/>
+      <w:r>
+        <w:rPr>
+          <w:sz w:val="20"/>
+          <w:szCs w:val="20"/>
+        </w:rPr>
+        <w:t>sth</w:t>
+      </w:r>
+      <w:proofErr w:type="spellEnd"/>
+      <w:r>
+        <w:rPr>
+          <w:sz w:val="20"/>
+          <w:szCs w:val="20"/>
+        </w:rPr>
+        <w:t xml:space="preserve"> w 2 tables (foreign keys)</w:t>
       </w:r>
     </w:p>
     <w:p>
@@ -882,14 +753,7 @@
           <w:sz w:val="20"/>
           <w:szCs w:val="20"/>
         </w:rPr>
-        <w:t>Use Mammoth library in python to convert a .docx file into a .md file</w:t>
-      </w:r>
-      <w:r>
-        <w:rPr>
-          <w:sz w:val="20"/>
-          <w:szCs w:val="20"/>
-        </w:rPr>
-        <w:t xml:space="preserve"> [15/9]</w:t>
+        <w:t>Use Mammoth library in python to convert a .docx file into a .md file [15/9]</w:t>
       </w:r>
     </w:p>
     <w:p>
@@ -910,7 +774,39 @@
           <w:sz w:val="20"/>
           <w:szCs w:val="20"/>
         </w:rPr>
-        <w:t>As a knowledge base administrator, I want to convert Microsoft Word (.docx) files into Markdown (.md) files, so that document content can be easily stored, indexed, version-controlled, and used by AI-powered knowledge management systems</w:t>
+        <w:t xml:space="preserve">As a knowledge base administrator, I want to convert Microsoft </w:t>
+      </w:r>
+      <w:proofErr w:type="gramStart"/>
+      <w:r>
+        <w:rPr>
+          <w:sz w:val="20"/>
+          <w:szCs w:val="20"/>
+        </w:rPr>
+        <w:t>Word (.</w:t>
+      </w:r>
+      <w:proofErr w:type="gramEnd"/>
+      <w:r>
+        <w:rPr>
+          <w:sz w:val="20"/>
+          <w:szCs w:val="20"/>
+        </w:rPr>
+        <w:t xml:space="preserve">docx) files into </w:t>
+      </w:r>
+      <w:proofErr w:type="gramStart"/>
+      <w:r>
+        <w:rPr>
+          <w:sz w:val="20"/>
+          <w:szCs w:val="20"/>
+        </w:rPr>
+        <w:t>Markdown (.</w:t>
+      </w:r>
+      <w:proofErr w:type="gramEnd"/>
+      <w:r>
+        <w:rPr>
+          <w:sz w:val="20"/>
+          <w:szCs w:val="20"/>
+        </w:rPr>
+        <w:t>md) files, so that document content can be easily stored, indexed, version-controlled, and used by AI-powered knowledge management systems</w:t>
       </w:r>
     </w:p>
     <w:p>
@@ -926,8 +822,8 @@
           <w:rFonts w:eastAsia="Times New Roman" w:cs="Segoe UI"/>
           <w:color w:val="242424"/>
           <w:kern w:val="0"/>
-          <w:sz w:val="21"/>
-          <w:szCs w:val="21"/>
+          <w:sz w:val="20"/>
+          <w:szCs w:val="20"/>
           <w14:ligatures w14:val="none"/>
         </w:rPr>
       </w:pPr>
@@ -936,22 +832,35 @@
           <w:rFonts w:eastAsia="Times New Roman" w:cs="Segoe UI"/>
           <w:color w:val="242424"/>
           <w:kern w:val="0"/>
-          <w:sz w:val="21"/>
-          <w:szCs w:val="21"/>
+          <w:sz w:val="20"/>
+          <w:szCs w:val="20"/>
           <w14:ligatures w14:val="none"/>
         </w:rPr>
-        <w:t>use the pandas openpyxl tabulate package to convert excel to markdown</w:t>
-      </w:r>
+        <w:t xml:space="preserve">use the pandas </w:t>
+      </w:r>
+      <w:proofErr w:type="spellStart"/>
       <w:r>
         <w:rPr>
           <w:rFonts w:eastAsia="Times New Roman" w:cs="Segoe UI"/>
           <w:color w:val="242424"/>
           <w:kern w:val="0"/>
-          <w:sz w:val="21"/>
-          <w:szCs w:val="21"/>
+          <w:sz w:val="20"/>
+          <w:szCs w:val="20"/>
           <w14:ligatures w14:val="none"/>
         </w:rPr>
-        <w:t xml:space="preserve"> [15/9]</w:t>
+        <w:t>openpyxl</w:t>
+      </w:r>
+      <w:proofErr w:type="spellEnd"/>
+      <w:r>
+        <w:rPr>
+          <w:rFonts w:eastAsia="Times New Roman" w:cs="Segoe UI"/>
+          <w:color w:val="242424"/>
+          <w:kern w:val="0"/>
+          <w:sz w:val="20"/>
+          <w:szCs w:val="20"/>
+          <w14:ligatures w14:val="none"/>
+        </w:rPr>
+        <w:t xml:space="preserve"> tabulate package to convert excel to markdown [15/9]</w:t>
       </w:r>
     </w:p>
     <w:p>
@@ -986,7 +895,23 @@
           <w:sz w:val="20"/>
           <w:szCs w:val="20"/>
         </w:rPr>
-        <w:t>I want to convert an uploaded Excel file (.xls, .xlsx) into a Markdown (.md) document,</w:t>
+        <w:t>I want to convert an uploaded Excel file (.</w:t>
+      </w:r>
+      <w:proofErr w:type="spellStart"/>
+      <w:r>
+        <w:rPr>
+          <w:sz w:val="20"/>
+          <w:szCs w:val="20"/>
+        </w:rPr>
+        <w:t>xls</w:t>
+      </w:r>
+      <w:proofErr w:type="spellEnd"/>
+      <w:r>
+        <w:rPr>
+          <w:sz w:val="20"/>
+          <w:szCs w:val="20"/>
+        </w:rPr>
+        <w:t>, .xlsx) into a Markdown (.md) document,</w:t>
       </w:r>
       <w:r>
         <w:rPr>
@@ -1000,7 +925,14 @@
           <w:sz w:val="20"/>
           <w:szCs w:val="20"/>
         </w:rPr>
-        <w:t>So that spreadsheet content can be easily stored, indexed, version-controlled, and consumed by AI/LLM-based applications</w:t>
+        <w:t>so</w:t>
+      </w:r>
+      <w:r>
+        <w:rPr>
+          <w:sz w:val="20"/>
+          <w:szCs w:val="20"/>
+        </w:rPr>
+        <w:t xml:space="preserve"> that spreadsheet content can be easily stored, indexed, version-controlled, and consumed by AI/LLM-based applications</w:t>
       </w:r>
     </w:p>
     <w:p>
@@ -1058,21 +990,7 @@
           <w:sz w:val="20"/>
           <w:szCs w:val="20"/>
         </w:rPr>
-        <w:t xml:space="preserve">code-vision.zip: </w:t>
-      </w:r>
-      <w:r>
-        <w:rPr>
-          <w:sz w:val="20"/>
-          <w:szCs w:val="20"/>
-        </w:rPr>
-        <w:t>practice tool calling function with sidebar chat</w:t>
-      </w:r>
-      <w:r>
-        <w:rPr>
-          <w:sz w:val="20"/>
-          <w:szCs w:val="20"/>
-        </w:rPr>
-        <w:t xml:space="preserve"> [17/9]</w:t>
+        <w:t>code-vision.zip: practice tool calling function with sidebar chat [17/9]</w:t>
       </w:r>
     </w:p>
     <w:p>
@@ -1090,6 +1008,7 @@
           <w:szCs w:val="20"/>
         </w:rPr>
       </w:pPr>
+      <w:proofErr w:type="spellStart"/>
       <w:r>
         <w:rPr>
           <w:i/>
@@ -1097,7 +1016,17 @@
           <w:sz w:val="20"/>
           <w:szCs w:val="20"/>
         </w:rPr>
-        <w:t>spirare OpenAI compliment doc [17/9]</w:t>
+        <w:t>spirare</w:t>
+      </w:r>
+      <w:proofErr w:type="spellEnd"/>
+      <w:r>
+        <w:rPr>
+          <w:i/>
+          <w:iCs/>
+          <w:sz w:val="20"/>
+          <w:szCs w:val="20"/>
+        </w:rPr>
+        <w:t xml:space="preserve"> OpenAI compliment doc [17/9]</w:t>
       </w:r>
     </w:p>
     <w:p>
@@ -1127,55 +1056,723 @@
           <w:sz w:val="20"/>
           <w:szCs w:val="20"/>
         </w:rPr>
+        <w:t xml:space="preserve"> Tool Calling with LLM Topics To Cover: Agentic workflow using </w:t>
+      </w:r>
+      <w:proofErr w:type="spellStart"/>
+      <w:r>
+        <w:rPr>
+          <w:sz w:val="20"/>
+          <w:szCs w:val="20"/>
+        </w:rPr>
+        <w:t>Langgraph</w:t>
+      </w:r>
+      <w:proofErr w:type="spellEnd"/>
+      <w:r>
+        <w:rPr>
+          <w:sz w:val="20"/>
+          <w:szCs w:val="20"/>
+        </w:rPr>
+        <w:t xml:space="preserve"> Exercises: Create your own agent workflows</w:t>
+      </w:r>
+      <w:r>
+        <w:rPr>
+          <w:sz w:val="20"/>
+          <w:szCs w:val="20"/>
+        </w:rPr>
+        <w:t xml:space="preserve"> [18/9]</w:t>
+      </w:r>
+    </w:p>
+    <w:p>
+      <w:pPr>
+        <w:spacing w:line="240" w:lineRule="auto"/>
+        <w:rPr>
+          <w:b/>
+          <w:bCs/>
+          <w:sz w:val="20"/>
+          <w:szCs w:val="20"/>
+        </w:rPr>
+      </w:pPr>
+      <w:proofErr w:type="spellStart"/>
+      <w:r>
+        <w:rPr>
+          <w:b/>
+          <w:bCs/>
+          <w:sz w:val="20"/>
+          <w:szCs w:val="20"/>
+        </w:rPr>
+        <w:t>Wk</w:t>
+      </w:r>
+      <w:proofErr w:type="spellEnd"/>
+      <w:r>
+        <w:rPr>
+          <w:b/>
+          <w:bCs/>
+          <w:sz w:val="20"/>
+          <w:szCs w:val="20"/>
+        </w:rPr>
+        <w:t xml:space="preserve"> 4: 21/9 – 25/9</w:t>
+      </w:r>
+    </w:p>
+    <w:p>
+      <w:pPr>
+        <w:pStyle w:val="ListParagraph"/>
+        <w:numPr>
+          <w:ilvl w:val="0"/>
+          <w:numId w:val="8"/>
+        </w:numPr>
+        <w:spacing w:line="240" w:lineRule="auto"/>
+        <w:rPr>
+          <w:sz w:val="20"/>
+          <w:szCs w:val="20"/>
+        </w:rPr>
+      </w:pPr>
+      <w:r>
+        <w:rPr>
+          <w:b/>
+          <w:bCs/>
+          <w:sz w:val="20"/>
+          <w:szCs w:val="20"/>
+        </w:rPr>
+        <w:t>[MEETING]</w:t>
+      </w:r>
+      <w:r>
+        <w:rPr>
+          <w:sz w:val="20"/>
+          <w:szCs w:val="20"/>
+        </w:rPr>
         <w:t xml:space="preserve"> </w:t>
       </w:r>
-      <w:r>
-        <w:rPr>
-          <w:sz w:val="20"/>
-          <w:szCs w:val="20"/>
-        </w:rPr>
-        <w:t>Tool Calling with LLM</w:t>
-      </w:r>
-      <w:r>
-        <w:rPr>
-          <w:sz w:val="20"/>
-          <w:szCs w:val="20"/>
-        </w:rPr>
-        <w:t xml:space="preserve"> </w:t>
-      </w:r>
-      <w:r>
-        <w:rPr>
-          <w:sz w:val="20"/>
-          <w:szCs w:val="20"/>
-        </w:rPr>
-        <w:t>Topics To Cover: Agentic workflow using Langgraph</w:t>
-      </w:r>
-      <w:r>
-        <w:rPr>
-          <w:sz w:val="20"/>
-          <w:szCs w:val="20"/>
-        </w:rPr>
-        <w:t xml:space="preserve"> </w:t>
-      </w:r>
-      <w:r>
-        <w:rPr>
-          <w:sz w:val="20"/>
-          <w:szCs w:val="20"/>
-        </w:rPr>
-        <w:t>Exercises: Create your own agent workflows</w:t>
-      </w:r>
-      <w:r>
-        <w:rPr>
-          <w:sz w:val="20"/>
-          <w:szCs w:val="20"/>
-        </w:rPr>
-        <w:t xml:space="preserve"> [18/9]</w:t>
+      <w:proofErr w:type="spellStart"/>
+      <w:r>
+        <w:rPr>
+          <w:sz w:val="20"/>
+          <w:szCs w:val="20"/>
+        </w:rPr>
+        <w:t>CodeVision</w:t>
+      </w:r>
+      <w:proofErr w:type="spellEnd"/>
+      <w:r>
+        <w:rPr>
+          <w:sz w:val="20"/>
+          <w:szCs w:val="20"/>
+        </w:rPr>
+        <w:t xml:space="preserve"> 1</w:t>
+      </w:r>
+      <w:r>
+        <w:rPr>
+          <w:sz w:val="20"/>
+          <w:szCs w:val="20"/>
+          <w:vertAlign w:val="superscript"/>
+        </w:rPr>
+        <w:t>st</w:t>
+      </w:r>
+      <w:r>
+        <w:rPr>
+          <w:sz w:val="20"/>
+          <w:szCs w:val="20"/>
+        </w:rPr>
+        <w:t xml:space="preserve"> Sprint - Stories &amp; Acceptance Criteria </w:t>
+      </w:r>
+      <w:proofErr w:type="spellStart"/>
+      <w:r>
+        <w:rPr>
+          <w:sz w:val="20"/>
+          <w:szCs w:val="20"/>
+        </w:rPr>
+        <w:t>Walkthru</w:t>
+      </w:r>
+      <w:proofErr w:type="spellEnd"/>
+      <w:r>
+        <w:rPr>
+          <w:sz w:val="20"/>
+          <w:szCs w:val="20"/>
+        </w:rPr>
+        <w:t xml:space="preserve"> [21/9]</w:t>
+      </w:r>
+    </w:p>
+    <w:p>
+      <w:pPr>
+        <w:pStyle w:val="ListParagraph"/>
+        <w:numPr>
+          <w:ilvl w:val="0"/>
+          <w:numId w:val="8"/>
+        </w:numPr>
+        <w:spacing w:line="240" w:lineRule="auto"/>
+        <w:rPr>
+          <w:sz w:val="20"/>
+          <w:szCs w:val="20"/>
+        </w:rPr>
+      </w:pPr>
+      <w:r>
+        <w:rPr>
+          <w:sz w:val="20"/>
+          <w:szCs w:val="20"/>
+        </w:rPr>
+        <w:t>Capability Matrix Upload</w:t>
+      </w:r>
+      <w:r>
+        <w:rPr>
+          <w:sz w:val="20"/>
+          <w:szCs w:val="20"/>
+        </w:rPr>
+        <w:t xml:space="preserve"> [21/9]</w:t>
+      </w:r>
+    </w:p>
+    <w:p>
+      <w:pPr>
+        <w:pStyle w:val="ListParagraph"/>
+        <w:numPr>
+          <w:ilvl w:val="1"/>
+          <w:numId w:val="8"/>
+        </w:numPr>
+        <w:spacing w:line="240" w:lineRule="auto"/>
+        <w:rPr>
+          <w:sz w:val="20"/>
+          <w:szCs w:val="20"/>
+        </w:rPr>
+      </w:pPr>
+      <w:r>
+        <w:rPr>
+          <w:sz w:val="20"/>
+          <w:szCs w:val="20"/>
+        </w:rPr>
+        <w:t>As a user, I want to upload capability matrices in spreadsheet formats so that application capabilities can be catalogued. After ingesting the capability matrix file. store the data into a table that will contain all the capabilities - TABLE COLUMNS, L1-L6 Capability, APP_CODE</w:t>
+      </w:r>
+    </w:p>
+    <w:p>
+      <w:pPr>
+        <w:numPr>
+          <w:ilvl w:val="2"/>
+          <w:numId w:val="8"/>
+        </w:numPr>
+        <w:shd w:val="clear" w:color="auto" w:fill="FFFFFF"/>
+        <w:spacing w:before="100" w:beforeAutospacing="1" w:after="100" w:afterAutospacing="1" w:line="240" w:lineRule="auto"/>
+        <w:rPr>
+          <w:rFonts w:eastAsia="Times New Roman" w:cs="Segoe UI"/>
+          <w:color w:val="242424"/>
+          <w:kern w:val="0"/>
+          <w:sz w:val="20"/>
+          <w:szCs w:val="20"/>
+          <w14:ligatures w14:val="none"/>
+        </w:rPr>
+      </w:pPr>
+      <w:r>
+        <w:rPr>
+          <w:rFonts w:eastAsia="Times New Roman" w:cs="Segoe UI"/>
+          <w:color w:val="242424"/>
+          <w:kern w:val="0"/>
+          <w:sz w:val="20"/>
+          <w:szCs w:val="20"/>
+          <w14:ligatures w14:val="none"/>
+        </w:rPr>
+        <w:t>ingest excel</w:t>
+      </w:r>
+    </w:p>
+    <w:p>
+      <w:pPr>
+        <w:numPr>
+          <w:ilvl w:val="2"/>
+          <w:numId w:val="8"/>
+        </w:numPr>
+        <w:shd w:val="clear" w:color="auto" w:fill="FFFFFF"/>
+        <w:spacing w:before="100" w:beforeAutospacing="1" w:after="100" w:afterAutospacing="1" w:line="240" w:lineRule="auto"/>
+        <w:rPr>
+          <w:rFonts w:eastAsia="Times New Roman" w:cs="Segoe UI"/>
+          <w:color w:val="242424"/>
+          <w:kern w:val="0"/>
+          <w:sz w:val="20"/>
+          <w:szCs w:val="20"/>
+          <w14:ligatures w14:val="none"/>
+        </w:rPr>
+      </w:pPr>
+      <w:r>
+        <w:rPr>
+          <w:rFonts w:eastAsia="Times New Roman" w:cs="Segoe UI"/>
+          <w:color w:val="242424"/>
+          <w:kern w:val="0"/>
+          <w:sz w:val="20"/>
+          <w:szCs w:val="20"/>
+          <w14:ligatures w14:val="none"/>
+        </w:rPr>
+        <w:t>convert pandas</w:t>
+      </w:r>
+    </w:p>
+    <w:p>
+      <w:pPr>
+        <w:numPr>
+          <w:ilvl w:val="2"/>
+          <w:numId w:val="8"/>
+        </w:numPr>
+        <w:shd w:val="clear" w:color="auto" w:fill="FFFFFF"/>
+        <w:spacing w:before="100" w:beforeAutospacing="1" w:after="100" w:afterAutospacing="1" w:line="240" w:lineRule="auto"/>
+        <w:rPr>
+          <w:rFonts w:eastAsia="Times New Roman" w:cs="Segoe UI"/>
+          <w:color w:val="242424"/>
+          <w:kern w:val="0"/>
+          <w:sz w:val="20"/>
+          <w:szCs w:val="20"/>
+          <w14:ligatures w14:val="none"/>
+        </w:rPr>
+      </w:pPr>
+      <w:r>
+        <w:rPr>
+          <w:rFonts w:eastAsia="Times New Roman" w:cs="Segoe UI"/>
+          <w:color w:val="242424"/>
+          <w:kern w:val="0"/>
+          <w:sz w:val="20"/>
+          <w:szCs w:val="20"/>
+          <w14:ligatures w14:val="none"/>
+        </w:rPr>
+        <w:t>Save</w:t>
+      </w:r>
+      <w:r>
+        <w:rPr>
+          <w:rFonts w:eastAsia="Times New Roman" w:cs="Segoe UI"/>
+          <w:color w:val="242424"/>
+          <w:kern w:val="0"/>
+          <w:sz w:val="20"/>
+          <w:szCs w:val="20"/>
+          <w14:ligatures w14:val="none"/>
+        </w:rPr>
+        <w:t xml:space="preserve"> to </w:t>
+      </w:r>
+      <w:proofErr w:type="spellStart"/>
+      <w:r>
+        <w:rPr>
+          <w:rFonts w:eastAsia="Times New Roman" w:cs="Segoe UI"/>
+          <w:color w:val="242424"/>
+          <w:kern w:val="0"/>
+          <w:sz w:val="20"/>
+          <w:szCs w:val="20"/>
+          <w14:ligatures w14:val="none"/>
+        </w:rPr>
+        <w:t>sqlite</w:t>
+      </w:r>
+      <w:proofErr w:type="spellEnd"/>
+      <w:r>
+        <w:rPr>
+          <w:rFonts w:eastAsia="Times New Roman" w:cs="Segoe UI"/>
+          <w:color w:val="242424"/>
+          <w:kern w:val="0"/>
+          <w:sz w:val="20"/>
+          <w:szCs w:val="20"/>
+          <w14:ligatures w14:val="none"/>
+        </w:rPr>
+        <w:t xml:space="preserve"> table</w:t>
+      </w:r>
+    </w:p>
+    <w:p>
+      <w:pPr>
+        <w:numPr>
+          <w:ilvl w:val="0"/>
+          <w:numId w:val="8"/>
+        </w:numPr>
+        <w:shd w:val="clear" w:color="auto" w:fill="FFFFFF"/>
+        <w:spacing w:before="100" w:beforeAutospacing="1" w:after="100" w:afterAutospacing="1" w:line="240" w:lineRule="auto"/>
+        <w:rPr>
+          <w:rFonts w:eastAsia="Times New Roman" w:cs="Segoe UI"/>
+          <w:color w:val="242424"/>
+          <w:kern w:val="0"/>
+          <w:sz w:val="20"/>
+          <w:szCs w:val="20"/>
+          <w14:ligatures w14:val="none"/>
+        </w:rPr>
+      </w:pPr>
+      <w:r>
+        <w:rPr>
+          <w:rFonts w:eastAsia="Times New Roman" w:cs="Segoe UI"/>
+          <w:color w:val="242424"/>
+          <w:kern w:val="0"/>
+          <w:sz w:val="20"/>
+          <w:szCs w:val="20"/>
+          <w14:ligatures w14:val="none"/>
+        </w:rPr>
+        <w:t>Capability Matrix Upload Trigger</w:t>
+      </w:r>
+      <w:r>
+        <w:rPr>
+          <w:rFonts w:eastAsia="Times New Roman" w:cs="Segoe UI"/>
+          <w:color w:val="242424"/>
+          <w:kern w:val="0"/>
+          <w:sz w:val="20"/>
+          <w:szCs w:val="20"/>
+          <w14:ligatures w14:val="none"/>
+        </w:rPr>
+        <w:t xml:space="preserve"> [22/9]</w:t>
+      </w:r>
+    </w:p>
+    <w:p>
+      <w:pPr>
+        <w:numPr>
+          <w:ilvl w:val="1"/>
+          <w:numId w:val="8"/>
+        </w:numPr>
+        <w:shd w:val="clear" w:color="auto" w:fill="FFFFFF"/>
+        <w:spacing w:before="100" w:beforeAutospacing="1" w:after="100" w:afterAutospacing="1" w:line="240" w:lineRule="auto"/>
+        <w:rPr>
+          <w:rFonts w:eastAsia="Times New Roman" w:cs="Segoe UI"/>
+          <w:color w:val="242424"/>
+          <w:kern w:val="0"/>
+          <w:sz w:val="20"/>
+          <w:szCs w:val="20"/>
+          <w14:ligatures w14:val="none"/>
+        </w:rPr>
+      </w:pPr>
+      <w:r>
+        <w:rPr>
+          <w:rFonts w:eastAsia="Times New Roman" w:cs="Segoe UI"/>
+          <w:color w:val="242424"/>
+          <w:kern w:val="0"/>
+          <w:sz w:val="20"/>
+          <w:szCs w:val="20"/>
+          <w14:ligatures w14:val="none"/>
+        </w:rPr>
+        <w:t xml:space="preserve">As a </w:t>
+      </w:r>
+      <w:r>
+        <w:rPr>
+          <w:rFonts w:eastAsia="Times New Roman" w:cs="Segoe UI"/>
+          <w:color w:val="242424"/>
+          <w:kern w:val="0"/>
+          <w:sz w:val="20"/>
+          <w:szCs w:val="20"/>
+          <w14:ligatures w14:val="none"/>
+        </w:rPr>
+        <w:t>user I</w:t>
+      </w:r>
+      <w:r>
+        <w:rPr>
+          <w:rFonts w:eastAsia="Times New Roman" w:cs="Segoe UI"/>
+          <w:color w:val="242424"/>
+          <w:kern w:val="0"/>
+          <w:sz w:val="20"/>
+          <w:szCs w:val="20"/>
+          <w14:ligatures w14:val="none"/>
+        </w:rPr>
+        <w:t xml:space="preserve"> want to have the capability to upload a capability matrix during application onboarding</w:t>
+      </w:r>
+    </w:p>
+    <w:p>
+      <w:pPr>
+        <w:numPr>
+          <w:ilvl w:val="2"/>
+          <w:numId w:val="8"/>
+        </w:numPr>
+        <w:shd w:val="clear" w:color="auto" w:fill="FFFFFF"/>
+        <w:spacing w:before="100" w:beforeAutospacing="1" w:after="100" w:afterAutospacing="1" w:line="240" w:lineRule="auto"/>
+        <w:rPr>
+          <w:rFonts w:eastAsia="Times New Roman" w:cs="Segoe UI"/>
+          <w:color w:val="242424"/>
+          <w:kern w:val="0"/>
+          <w:sz w:val="20"/>
+          <w:szCs w:val="20"/>
+          <w14:ligatures w14:val="none"/>
+        </w:rPr>
+      </w:pPr>
+      <w:r>
+        <w:rPr>
+          <w:rFonts w:eastAsia="Times New Roman" w:cs="Segoe UI"/>
+          <w:color w:val="242424"/>
+          <w:kern w:val="0"/>
+          <w:sz w:val="20"/>
+          <w:szCs w:val="20"/>
+          <w14:ligatures w14:val="none"/>
+        </w:rPr>
+        <w:t>Add a new component under layouts.onboard_application_page.py to be able to accept user upload of capability matrix from users</w:t>
+      </w:r>
+    </w:p>
+    <w:p>
+      <w:pPr>
+        <w:numPr>
+          <w:ilvl w:val="2"/>
+          <w:numId w:val="8"/>
+        </w:numPr>
+        <w:shd w:val="clear" w:color="auto" w:fill="FFFFFF"/>
+        <w:spacing w:before="100" w:beforeAutospacing="1" w:after="100" w:afterAutospacing="1" w:line="240" w:lineRule="auto"/>
+        <w:rPr>
+          <w:rFonts w:eastAsia="Times New Roman" w:cs="Segoe UI"/>
+          <w:color w:val="242424"/>
+          <w:kern w:val="0"/>
+          <w:sz w:val="20"/>
+          <w:szCs w:val="20"/>
+          <w14:ligatures w14:val="none"/>
+        </w:rPr>
+      </w:pPr>
+      <w:r>
+        <w:rPr>
+          <w:rFonts w:eastAsia="Times New Roman" w:cs="Segoe UI"/>
+          <w:color w:val="242424"/>
+          <w:kern w:val="0"/>
+          <w:sz w:val="20"/>
+          <w:szCs w:val="20"/>
+          <w14:ligatures w14:val="none"/>
+        </w:rPr>
+        <w:lastRenderedPageBreak/>
+        <w:t xml:space="preserve">Trigger the </w:t>
+      </w:r>
+      <w:proofErr w:type="spellStart"/>
+      <w:r>
+        <w:rPr>
+          <w:rFonts w:eastAsia="Times New Roman" w:cs="Segoe UI"/>
+          <w:color w:val="242424"/>
+          <w:kern w:val="0"/>
+          <w:sz w:val="20"/>
+          <w:szCs w:val="20"/>
+          <w14:ligatures w14:val="none"/>
+        </w:rPr>
+        <w:t>db_table_functions.db_tbl_</w:t>
+      </w:r>
+      <w:proofErr w:type="gramStart"/>
+      <w:r>
+        <w:rPr>
+          <w:rFonts w:eastAsia="Times New Roman" w:cs="Segoe UI"/>
+          <w:color w:val="242424"/>
+          <w:kern w:val="0"/>
+          <w:sz w:val="20"/>
+          <w:szCs w:val="20"/>
+          <w14:ligatures w14:val="none"/>
+        </w:rPr>
+        <w:t>capabilities.ingest</w:t>
+      </w:r>
+      <w:proofErr w:type="gramEnd"/>
+      <w:r>
+        <w:rPr>
+          <w:rFonts w:eastAsia="Times New Roman" w:cs="Segoe UI"/>
+          <w:color w:val="242424"/>
+          <w:kern w:val="0"/>
+          <w:sz w:val="20"/>
+          <w:szCs w:val="20"/>
+          <w14:ligatures w14:val="none"/>
+        </w:rPr>
+        <w:t>_capability_matrix</w:t>
+      </w:r>
+      <w:proofErr w:type="spellEnd"/>
+      <w:r>
+        <w:rPr>
+          <w:rFonts w:eastAsia="Times New Roman" w:cs="Segoe UI"/>
+          <w:color w:val="242424"/>
+          <w:kern w:val="0"/>
+          <w:sz w:val="20"/>
+          <w:szCs w:val="20"/>
+          <w14:ligatures w14:val="none"/>
+        </w:rPr>
+        <w:t xml:space="preserve"> whenever the user uploads the capability matrix</w:t>
+      </w:r>
+    </w:p>
+    <w:p>
+      <w:pPr>
+        <w:numPr>
+          <w:ilvl w:val="0"/>
+          <w:numId w:val="8"/>
+        </w:numPr>
+        <w:shd w:val="clear" w:color="auto" w:fill="FFFFFF"/>
+        <w:spacing w:before="100" w:beforeAutospacing="1" w:after="100" w:afterAutospacing="1" w:line="240" w:lineRule="auto"/>
+        <w:rPr>
+          <w:rFonts w:eastAsia="Times New Roman" w:cs="Segoe UI"/>
+          <w:color w:val="242424"/>
+          <w:kern w:val="0"/>
+          <w:sz w:val="20"/>
+          <w:szCs w:val="20"/>
+          <w14:ligatures w14:val="none"/>
+        </w:rPr>
+      </w:pPr>
+      <w:r>
+        <w:rPr>
+          <w:rFonts w:eastAsia="Times New Roman" w:cs="Segoe UI"/>
+          <w:color w:val="242424"/>
+          <w:kern w:val="0"/>
+          <w:sz w:val="20"/>
+          <w:szCs w:val="20"/>
+          <w14:ligatures w14:val="none"/>
+        </w:rPr>
+        <w:t>XML File</w:t>
+      </w:r>
+      <w:r>
+        <w:rPr>
+          <w:rFonts w:eastAsia="Times New Roman" w:cs="Segoe UI"/>
+          <w:color w:val="242424"/>
+          <w:kern w:val="0"/>
+          <w:sz w:val="20"/>
+          <w:szCs w:val="20"/>
+          <w14:ligatures w14:val="none"/>
+        </w:rPr>
+        <w:t xml:space="preserve"> Upload Trigger</w:t>
+      </w:r>
+      <w:r>
+        <w:rPr>
+          <w:rFonts w:eastAsia="Times New Roman" w:cs="Segoe UI"/>
+          <w:color w:val="242424"/>
+          <w:kern w:val="0"/>
+          <w:sz w:val="20"/>
+          <w:szCs w:val="20"/>
+          <w14:ligatures w14:val="none"/>
+        </w:rPr>
+        <w:t xml:space="preserve"> [2</w:t>
+      </w:r>
+      <w:r>
+        <w:rPr>
+          <w:rFonts w:eastAsia="Times New Roman" w:cs="Segoe UI"/>
+          <w:color w:val="242424"/>
+          <w:kern w:val="0"/>
+          <w:sz w:val="20"/>
+          <w:szCs w:val="20"/>
+          <w14:ligatures w14:val="none"/>
+        </w:rPr>
+        <w:t>3</w:t>
+      </w:r>
+      <w:r>
+        <w:rPr>
+          <w:rFonts w:eastAsia="Times New Roman" w:cs="Segoe UI"/>
+          <w:color w:val="242424"/>
+          <w:kern w:val="0"/>
+          <w:sz w:val="20"/>
+          <w:szCs w:val="20"/>
+          <w14:ligatures w14:val="none"/>
+        </w:rPr>
+        <w:t>/9]</w:t>
+      </w:r>
+    </w:p>
+    <w:p>
+      <w:pPr>
+        <w:numPr>
+          <w:ilvl w:val="1"/>
+          <w:numId w:val="8"/>
+        </w:numPr>
+        <w:shd w:val="clear" w:color="auto" w:fill="FFFFFF"/>
+        <w:spacing w:before="100" w:beforeAutospacing="1" w:after="100" w:afterAutospacing="1" w:line="240" w:lineRule="auto"/>
+        <w:rPr>
+          <w:rFonts w:eastAsia="Times New Roman" w:cs="Segoe UI"/>
+          <w:color w:val="242424"/>
+          <w:kern w:val="0"/>
+          <w:sz w:val="20"/>
+          <w:szCs w:val="20"/>
+          <w14:ligatures w14:val="none"/>
+        </w:rPr>
+      </w:pPr>
+      <w:r>
+        <w:rPr>
+          <w:rFonts w:eastAsia="Times New Roman" w:cs="Segoe UI"/>
+          <w:color w:val="242424"/>
+          <w:kern w:val="0"/>
+          <w:sz w:val="20"/>
+          <w:szCs w:val="20"/>
+          <w14:ligatures w14:val="none"/>
+        </w:rPr>
+        <w:t xml:space="preserve">As a user I want to have the capability to upload </w:t>
+      </w:r>
+      <w:proofErr w:type="gramStart"/>
+      <w:r>
+        <w:rPr>
+          <w:rFonts w:eastAsia="Times New Roman" w:cs="Segoe UI"/>
+          <w:color w:val="242424"/>
+          <w:kern w:val="0"/>
+          <w:sz w:val="20"/>
+          <w:szCs w:val="20"/>
+          <w14:ligatures w14:val="none"/>
+        </w:rPr>
+        <w:t xml:space="preserve">a </w:t>
+      </w:r>
+      <w:r>
+        <w:rPr>
+          <w:rFonts w:eastAsia="Times New Roman" w:cs="Segoe UI"/>
+          <w:color w:val="242424"/>
+          <w:kern w:val="0"/>
+          <w:sz w:val="20"/>
+          <w:szCs w:val="20"/>
+          <w14:ligatures w14:val="none"/>
+        </w:rPr>
+        <w:t>xml</w:t>
+      </w:r>
+      <w:proofErr w:type="gramEnd"/>
+      <w:r>
+        <w:rPr>
+          <w:rFonts w:eastAsia="Times New Roman" w:cs="Segoe UI"/>
+          <w:color w:val="242424"/>
+          <w:kern w:val="0"/>
+          <w:sz w:val="20"/>
+          <w:szCs w:val="20"/>
+          <w14:ligatures w14:val="none"/>
+        </w:rPr>
+        <w:t xml:space="preserve"> file</w:t>
+      </w:r>
+      <w:r>
+        <w:rPr>
+          <w:rFonts w:eastAsia="Times New Roman" w:cs="Segoe UI"/>
+          <w:color w:val="242424"/>
+          <w:kern w:val="0"/>
+          <w:sz w:val="20"/>
+          <w:szCs w:val="20"/>
+          <w14:ligatures w14:val="none"/>
+        </w:rPr>
+        <w:t xml:space="preserve"> during application onboarding</w:t>
+      </w:r>
+    </w:p>
+    <w:p>
+      <w:pPr>
+        <w:numPr>
+          <w:ilvl w:val="2"/>
+          <w:numId w:val="8"/>
+        </w:numPr>
+        <w:shd w:val="clear" w:color="auto" w:fill="FFFFFF"/>
+        <w:spacing w:before="100" w:beforeAutospacing="1" w:after="100" w:afterAutospacing="1" w:line="240" w:lineRule="auto"/>
+        <w:rPr>
+          <w:rFonts w:eastAsia="Times New Roman" w:cs="Segoe UI"/>
+          <w:color w:val="242424"/>
+          <w:kern w:val="0"/>
+          <w:sz w:val="20"/>
+          <w:szCs w:val="20"/>
+          <w14:ligatures w14:val="none"/>
+        </w:rPr>
+      </w:pPr>
+      <w:r>
+        <w:rPr>
+          <w:rFonts w:eastAsia="Times New Roman" w:cs="Segoe UI"/>
+          <w:color w:val="242424"/>
+          <w:kern w:val="0"/>
+          <w:sz w:val="20"/>
+          <w:szCs w:val="20"/>
+          <w14:ligatures w14:val="none"/>
+        </w:rPr>
+        <w:t xml:space="preserve">Add a new component under layouts.onboard_application_page.py to be able to accept user upload of </w:t>
+      </w:r>
+      <w:r>
+        <w:rPr>
+          <w:rFonts w:eastAsia="Times New Roman" w:cs="Segoe UI"/>
+          <w:color w:val="242424"/>
+          <w:kern w:val="0"/>
+          <w:sz w:val="20"/>
+          <w:szCs w:val="20"/>
+          <w14:ligatures w14:val="none"/>
+        </w:rPr>
+        <w:t>xml file</w:t>
+      </w:r>
+      <w:r>
+        <w:rPr>
+          <w:rFonts w:eastAsia="Times New Roman" w:cs="Segoe UI"/>
+          <w:color w:val="242424"/>
+          <w:kern w:val="0"/>
+          <w:sz w:val="20"/>
+          <w:szCs w:val="20"/>
+          <w14:ligatures w14:val="none"/>
+        </w:rPr>
+        <w:t xml:space="preserve"> from user</w:t>
+      </w:r>
+      <w:r>
+        <w:rPr>
+          <w:rFonts w:eastAsia="Times New Roman" w:cs="Segoe UI"/>
+          <w:color w:val="242424"/>
+          <w:kern w:val="0"/>
+          <w:sz w:val="20"/>
+          <w:szCs w:val="20"/>
+          <w14:ligatures w14:val="none"/>
+        </w:rPr>
+        <w:t>s</w:t>
       </w:r>
     </w:p>
     <w:sectPr>
-      <w:footerReference w:type="even" r:id="rId8"/>
-      <w:footerReference w:type="default" r:id="rId9"/>
-      <w:footerReference w:type="first" r:id="rId10"/>
+      <w:footerReference w:type="even" r:id="rId9"/>
+      <w:footerReference w:type="default" r:id="rId10"/>
+      <w:footerReference w:type="first" r:id="rId11"/>
       <w:pgSz w:w="12240" w:h="15840"/>
       <w:pgMar w:top="1440" w:right="1440" w:bottom="1440" w:left="1440" w:header="720" w:footer="720" w:gutter="0"/>
       <w:cols w:space="720"/>
@@ -1628,6 +2225,211 @@
 <file path=word/numbering.xml><?xml version="1.0" encoding="utf-8"?>
 <w:numbering xmlns:wpc="http://schemas.microsoft.com/office/word/2010/wordprocessingCanvas" xmlns:cx="http://schemas.microsoft.com/office/drawing/2014/chartex" xmlns:cx1="http://schemas.microsoft.com/office/drawing/2015/9/8/chartex" xmlns:cx2="http://schemas.microsoft.com/office/drawing/2015/10/21/chartex" xmlns:cx3="http://schemas.microsoft.com/office/drawing/2016/5/9/chartex" xmlns:cx4="http://schemas.microsoft.com/office/drawing/2016/5/10/chartex" xmlns:cx5="http://schemas.microsoft.com/office/drawing/2016/5/11/chartex" xmlns:cx6="http://schemas.microsoft.com/office/drawing/2016/5/12/chartex" xmlns:cx7="http://schemas.microsoft.com/office/drawing/2016/5/13/chartex" xmlns:cx8="http://schemas.microsoft.com/office/drawing/2016/5/14/chartex" xmlns:mc="http://schemas.openxmlformats.org/markup-compatibility/2006" xmlns:aink="http://schemas.microsoft.com/office/drawing/2016/ink" xmlns:am3d="http://schemas.microsoft.com/office/drawing/2017/model3d" xmlns:o="urn:schemas-microsoft-com:office:office" xmlns:oel="http://schemas.microsoft.com/office/2019/extlst" xmlns:r="http://schemas.openxmlformats.org/officeDocument/2006/relationships" xmlns:m="http://schemas.openxmlformats.org/officeDocument/2006/math" xmlns:v="urn:schemas-microsoft-com:vml" xmlns:wp14="http://schemas.microsoft.com/office/word/2010/wordprocessingDrawing" xmlns:wp="http://schemas.openxmlformats.org/drawingml/2006/wordprocessingDrawing" xmlns:w10="urn:schemas-microsoft-com:office:word" xmlns:w="http://schemas.openxmlformats.org/wordprocessingml/2006/main" xmlns:w14="http://schemas.microsoft.com/office/word/2010/wordml" xmlns:w15="http://schemas.microsoft.com/office/word/2012/wordml" xmlns:w16cei="http://schemas.microsoft.com/office/word/2026/wordml/cei" xmlns:w16cex="http://schemas.microsoft.com/office/word/2018/wordml/cex" xmlns:w16cid="http://schemas.microsoft.com/office/word/2016/wordml/cid" xmlns:w16="http://schemas.microsoft.com/office/word/2018/wordml" xmlns:w16du="http://schemas.microsoft.com/office/word/2023/wordml/word16du" xmlns:w16sdtdh="http://schemas.microsoft.com/office/word/2020/wordml/sdtdatahash" xmlns:w16sdtfl="http://schemas.microsoft.com/office/word/2024/wordml/sdtformatlock" xmlns:w16se="http://schemas.microsoft.com/office/word/2015/wordml/symex" xmlns:wpg="http://schemas.microsoft.com/office/word/2010/wordprocessingGroup" xmlns:wpi="http://schemas.microsoft.com/office/word/2010/wordprocessingInk" xmlns:wne="http://schemas.microsoft.com/office/word/2006/wordml" xmlns:wps="http://schemas.microsoft.com/office/word/2010/wordprocessingShape" mc:Ignorable="w14 w15 w16se w16cid w16 w16cex w16sdtdh w16sdtfl w16du wp14">
   <w:abstractNum w:abstractNumId="0" w15:restartNumberingAfterBreak="0">
+    <w:nsid w:val="00AC6E25"/>
+    <w:multiLevelType w:val="hybridMultilevel"/>
+    <w:tmpl w:val="36EA1C56"/>
+    <w:lvl w:ilvl="0" w:tplc="FFFFFFFF">
+      <w:start w:val="1"/>
+      <w:numFmt w:val="decimal"/>
+      <w:lvlText w:val="%1)"/>
+      <w:lvlJc w:val="left"/>
+      <w:pPr>
+        <w:ind w:left="720" w:hanging="360"/>
+      </w:pPr>
+      <w:rPr>
+        <w:rFonts w:hint="default"/>
+      </w:rPr>
+    </w:lvl>
+    <w:lvl w:ilvl="1" w:tplc="04090001">
+      <w:start w:val="1"/>
+      <w:numFmt w:val="bullet"/>
+      <w:lvlText w:val=""/>
+      <w:lvlJc w:val="left"/>
+      <w:pPr>
+        <w:ind w:left="1440" w:hanging="360"/>
+      </w:pPr>
+      <w:rPr>
+        <w:rFonts w:ascii="Symbol" w:hAnsi="Symbol" w:hint="default"/>
+      </w:rPr>
+    </w:lvl>
+    <w:lvl w:ilvl="2" w:tplc="FFFFFFFF" w:tentative="1">
+      <w:start w:val="1"/>
+      <w:numFmt w:val="lowerRoman"/>
+      <w:lvlText w:val="%3."/>
+      <w:lvlJc w:val="right"/>
+      <w:pPr>
+        <w:ind w:left="2160" w:hanging="180"/>
+      </w:pPr>
+    </w:lvl>
+    <w:lvl w:ilvl="3" w:tplc="FFFFFFFF" w:tentative="1">
+      <w:start w:val="1"/>
+      <w:numFmt w:val="decimal"/>
+      <w:lvlText w:val="%4."/>
+      <w:lvlJc w:val="left"/>
+      <w:pPr>
+        <w:ind w:left="2880" w:hanging="360"/>
+      </w:pPr>
+    </w:lvl>
+    <w:lvl w:ilvl="4" w:tplc="FFFFFFFF" w:tentative="1">
+      <w:start w:val="1"/>
+      <w:numFmt w:val="lowerLetter"/>
+      <w:lvlText w:val="%5."/>
+      <w:lvlJc w:val="left"/>
+      <w:pPr>
+        <w:ind w:left="3600" w:hanging="360"/>
+      </w:pPr>
+    </w:lvl>
+    <w:lvl w:ilvl="5" w:tplc="FFFFFFFF" w:tentative="1">
+      <w:start w:val="1"/>
+      <w:numFmt w:val="lowerRoman"/>
+      <w:lvlText w:val="%6."/>
+      <w:lvlJc w:val="right"/>
+      <w:pPr>
+        <w:ind w:left="4320" w:hanging="180"/>
+      </w:pPr>
+    </w:lvl>
+    <w:lvl w:ilvl="6" w:tplc="FFFFFFFF" w:tentative="1">
+      <w:start w:val="1"/>
+      <w:numFmt w:val="decimal"/>
+      <w:lvlText w:val="%7."/>
+      <w:lvlJc w:val="left"/>
+      <w:pPr>
+        <w:ind w:left="5040" w:hanging="360"/>
+      </w:pPr>
+    </w:lvl>
+    <w:lvl w:ilvl="7" w:tplc="FFFFFFFF" w:tentative="1">
+      <w:start w:val="1"/>
+      <w:numFmt w:val="lowerLetter"/>
+      <w:lvlText w:val="%8."/>
+      <w:lvlJc w:val="left"/>
+      <w:pPr>
+        <w:ind w:left="5760" w:hanging="360"/>
+      </w:pPr>
+    </w:lvl>
+    <w:lvl w:ilvl="8" w:tplc="FFFFFFFF" w:tentative="1">
+      <w:start w:val="1"/>
+      <w:numFmt w:val="lowerRoman"/>
+      <w:lvlText w:val="%9."/>
+      <w:lvlJc w:val="right"/>
+      <w:pPr>
+        <w:ind w:left="6480" w:hanging="180"/>
+      </w:pPr>
+    </w:lvl>
+  </w:abstractNum>
+  <w:abstractNum w:abstractNumId="1" w15:restartNumberingAfterBreak="0">
+    <w:nsid w:val="15175658"/>
+    <w:multiLevelType w:val="multilevel"/>
+    <w:tmpl w:val="72D03148"/>
+    <w:lvl w:ilvl="0">
+      <w:start w:val="1"/>
+      <w:numFmt w:val="decimal"/>
+      <w:lvlText w:val="%1."/>
+      <w:lvlJc w:val="left"/>
+      <w:pPr>
+        <w:tabs>
+          <w:tab w:val="num" w:pos="720"/>
+        </w:tabs>
+        <w:ind w:left="720" w:hanging="360"/>
+      </w:pPr>
+    </w:lvl>
+    <w:lvl w:ilvl="1" w:tentative="1">
+      <w:start w:val="1"/>
+      <w:numFmt w:val="decimal"/>
+      <w:lvlText w:val="%2."/>
+      <w:lvlJc w:val="left"/>
+      <w:pPr>
+        <w:tabs>
+          <w:tab w:val="num" w:pos="1440"/>
+        </w:tabs>
+        <w:ind w:left="1440" w:hanging="360"/>
+      </w:pPr>
+    </w:lvl>
+    <w:lvl w:ilvl="2" w:tentative="1">
+      <w:start w:val="1"/>
+      <w:numFmt w:val="decimal"/>
+      <w:lvlText w:val="%3."/>
+      <w:lvlJc w:val="left"/>
+      <w:pPr>
+        <w:tabs>
+          <w:tab w:val="num" w:pos="2160"/>
+        </w:tabs>
+        <w:ind w:left="2160" w:hanging="360"/>
+      </w:pPr>
+    </w:lvl>
+    <w:lvl w:ilvl="3" w:tentative="1">
+      <w:start w:val="1"/>
+      <w:numFmt w:val="decimal"/>
+      <w:lvlText w:val="%4."/>
+      <w:lvlJc w:val="left"/>
+      <w:pPr>
+        <w:tabs>
+          <w:tab w:val="num" w:pos="2880"/>
+        </w:tabs>
+        <w:ind w:left="2880" w:hanging="360"/>
+      </w:pPr>
+    </w:lvl>
+    <w:lvl w:ilvl="4" w:tentative="1">
+      <w:start w:val="1"/>
+      <w:numFmt w:val="decimal"/>
+      <w:lvlText w:val="%5."/>
+      <w:lvlJc w:val="left"/>
+      <w:pPr>
+        <w:tabs>
+          <w:tab w:val="num" w:pos="3600"/>
+        </w:tabs>
+        <w:ind w:left="3600" w:hanging="360"/>
+      </w:pPr>
+    </w:lvl>
+    <w:lvl w:ilvl="5" w:tentative="1">
+      <w:start w:val="1"/>
+      <w:numFmt w:val="decimal"/>
+      <w:lvlText w:val="%6."/>
+      <w:lvlJc w:val="left"/>
+      <w:pPr>
+        <w:tabs>
+          <w:tab w:val="num" w:pos="4320"/>
+        </w:tabs>
+        <w:ind w:left="4320" w:hanging="360"/>
+      </w:pPr>
+    </w:lvl>
+    <w:lvl w:ilvl="6" w:tentative="1">
+      <w:start w:val="1"/>
+      <w:numFmt w:val="decimal"/>
+      <w:lvlText w:val="%7."/>
+      <w:lvlJc w:val="left"/>
+      <w:pPr>
+        <w:tabs>
+          <w:tab w:val="num" w:pos="5040"/>
+        </w:tabs>
+        <w:ind w:left="5040" w:hanging="360"/>
+      </w:pPr>
+    </w:lvl>
+    <w:lvl w:ilvl="7" w:tentative="1">
+      <w:start w:val="1"/>
+      <w:numFmt w:val="decimal"/>
+      <w:lvlText w:val="%8."/>
+      <w:lvlJc w:val="left"/>
+      <w:pPr>
+        <w:tabs>
+          <w:tab w:val="num" w:pos="5760"/>
+        </w:tabs>
+        <w:ind w:left="5760" w:hanging="360"/>
+      </w:pPr>
+    </w:lvl>
+    <w:lvl w:ilvl="8" w:tentative="1">
+      <w:start w:val="1"/>
+      <w:numFmt w:val="decimal"/>
+      <w:lvlText w:val="%9."/>
+      <w:lvlJc w:val="left"/>
+      <w:pPr>
+        <w:tabs>
+          <w:tab w:val="num" w:pos="6480"/>
+        </w:tabs>
+        <w:ind w:left="6480" w:hanging="360"/>
+      </w:pPr>
+    </w:lvl>
+  </w:abstractNum>
+  <w:abstractNum w:abstractNumId="2" w15:restartNumberingAfterBreak="0">
     <w:nsid w:val="192608A0"/>
     <w:multiLevelType w:val="hybridMultilevel"/>
     <w:tmpl w:val="F5BCB10C"/>
@@ -1718,7 +2520,7 @@
       </w:pPr>
     </w:lvl>
   </w:abstractNum>
-  <w:abstractNum w:abstractNumId="1" w15:restartNumberingAfterBreak="0">
+  <w:abstractNum w:abstractNumId="3" w15:restartNumberingAfterBreak="0">
     <w:nsid w:val="1BCB6C10"/>
     <w:multiLevelType w:val="hybridMultilevel"/>
     <w:tmpl w:val="5DA85A48"/>
@@ -1831,7 +2633,96 @@
       </w:rPr>
     </w:lvl>
   </w:abstractNum>
-  <w:abstractNum w:abstractNumId="2" w15:restartNumberingAfterBreak="0">
+  <w:abstractNum w:abstractNumId="4" w15:restartNumberingAfterBreak="0">
+    <w:nsid w:val="255F764C"/>
+    <w:multiLevelType w:val="hybridMultilevel"/>
+    <w:tmpl w:val="544EC1E0"/>
+    <w:lvl w:ilvl="0" w:tplc="04090011">
+      <w:start w:val="1"/>
+      <w:numFmt w:val="decimal"/>
+      <w:lvlText w:val="%1)"/>
+      <w:lvlJc w:val="left"/>
+      <w:pPr>
+        <w:ind w:left="720" w:hanging="360"/>
+      </w:pPr>
+      <w:rPr>
+        <w:rFonts w:hint="default"/>
+      </w:rPr>
+    </w:lvl>
+    <w:lvl w:ilvl="1" w:tplc="04090019">
+      <w:start w:val="1"/>
+      <w:numFmt w:val="lowerLetter"/>
+      <w:lvlText w:val="%2."/>
+      <w:lvlJc w:val="left"/>
+      <w:pPr>
+        <w:ind w:left="1440" w:hanging="360"/>
+      </w:pPr>
+    </w:lvl>
+    <w:lvl w:ilvl="2" w:tplc="0409001B">
+      <w:start w:val="1"/>
+      <w:numFmt w:val="lowerRoman"/>
+      <w:lvlText w:val="%3."/>
+      <w:lvlJc w:val="right"/>
+      <w:pPr>
+        <w:ind w:left="2160" w:hanging="180"/>
+      </w:pPr>
+    </w:lvl>
+    <w:lvl w:ilvl="3" w:tplc="0409000F" w:tentative="1">
+      <w:start w:val="1"/>
+      <w:numFmt w:val="decimal"/>
+      <w:lvlText w:val="%4."/>
+      <w:lvlJc w:val="left"/>
+      <w:pPr>
+        <w:ind w:left="2880" w:hanging="360"/>
+      </w:pPr>
+    </w:lvl>
+    <w:lvl w:ilvl="4" w:tplc="04090019" w:tentative="1">
+      <w:start w:val="1"/>
+      <w:numFmt w:val="lowerLetter"/>
+      <w:lvlText w:val="%5."/>
+      <w:lvlJc w:val="left"/>
+      <w:pPr>
+        <w:ind w:left="3600" w:hanging="360"/>
+      </w:pPr>
+    </w:lvl>
+    <w:lvl w:ilvl="5" w:tplc="0409001B" w:tentative="1">
+      <w:start w:val="1"/>
+      <w:numFmt w:val="lowerRoman"/>
+      <w:lvlText w:val="%6."/>
+      <w:lvlJc w:val="right"/>
+      <w:pPr>
+        <w:ind w:left="4320" w:hanging="180"/>
+      </w:pPr>
+    </w:lvl>
+    <w:lvl w:ilvl="6" w:tplc="0409000F" w:tentative="1">
+      <w:start w:val="1"/>
+      <w:numFmt w:val="decimal"/>
+      <w:lvlText w:val="%7."/>
+      <w:lvlJc w:val="left"/>
+      <w:pPr>
+        <w:ind w:left="5040" w:hanging="360"/>
+      </w:pPr>
+    </w:lvl>
+    <w:lvl w:ilvl="7" w:tplc="04090019" w:tentative="1">
+      <w:start w:val="1"/>
+      <w:numFmt w:val="lowerLetter"/>
+      <w:lvlText w:val="%8."/>
+      <w:lvlJc w:val="left"/>
+      <w:pPr>
+        <w:ind w:left="5760" w:hanging="360"/>
+      </w:pPr>
+    </w:lvl>
+    <w:lvl w:ilvl="8" w:tplc="0409001B" w:tentative="1">
+      <w:start w:val="1"/>
+      <w:numFmt w:val="lowerRoman"/>
+      <w:lvlText w:val="%9."/>
+      <w:lvlJc w:val="right"/>
+      <w:pPr>
+        <w:ind w:left="6480" w:hanging="180"/>
+      </w:pPr>
+    </w:lvl>
+  </w:abstractNum>
+  <w:abstractNum w:abstractNumId="5" w15:restartNumberingAfterBreak="0">
     <w:nsid w:val="27994278"/>
     <w:multiLevelType w:val="hybridMultilevel"/>
     <w:tmpl w:val="7E6E9E50"/>
@@ -1920,7 +2811,99 @@
       </w:pPr>
     </w:lvl>
   </w:abstractNum>
-  <w:abstractNum w:abstractNumId="3" w15:restartNumberingAfterBreak="0">
+  <w:abstractNum w:abstractNumId="6" w15:restartNumberingAfterBreak="0">
+    <w:nsid w:val="43456027"/>
+    <w:multiLevelType w:val="hybridMultilevel"/>
+    <w:tmpl w:val="F12E318C"/>
+    <w:lvl w:ilvl="0" w:tplc="FFFFFFFF">
+      <w:start w:val="1"/>
+      <w:numFmt w:val="decimal"/>
+      <w:lvlText w:val="%1)"/>
+      <w:lvlJc w:val="left"/>
+      <w:pPr>
+        <w:ind w:left="720" w:hanging="360"/>
+      </w:pPr>
+      <w:rPr>
+        <w:rFonts w:hint="default"/>
+      </w:rPr>
+    </w:lvl>
+    <w:lvl w:ilvl="1" w:tplc="04090001">
+      <w:start w:val="1"/>
+      <w:numFmt w:val="bullet"/>
+      <w:lvlText w:val=""/>
+      <w:lvlJc w:val="left"/>
+      <w:pPr>
+        <w:ind w:left="1440" w:hanging="360"/>
+      </w:pPr>
+      <w:rPr>
+        <w:rFonts w:ascii="Symbol" w:hAnsi="Symbol" w:hint="default"/>
+      </w:rPr>
+    </w:lvl>
+    <w:lvl w:ilvl="2" w:tplc="FFFFFFFF" w:tentative="1">
+      <w:start w:val="1"/>
+      <w:numFmt w:val="lowerRoman"/>
+      <w:lvlText w:val="%3."/>
+      <w:lvlJc w:val="right"/>
+      <w:pPr>
+        <w:ind w:left="2160" w:hanging="180"/>
+      </w:pPr>
+    </w:lvl>
+    <w:lvl w:ilvl="3" w:tplc="FFFFFFFF" w:tentative="1">
+      <w:start w:val="1"/>
+      <w:numFmt w:val="decimal"/>
+      <w:lvlText w:val="%4."/>
+      <w:lvlJc w:val="left"/>
+      <w:pPr>
+        <w:ind w:left="2880" w:hanging="360"/>
+      </w:pPr>
+    </w:lvl>
+    <w:lvl w:ilvl="4" w:tplc="FFFFFFFF" w:tentative="1">
+      <w:start w:val="1"/>
+      <w:numFmt w:val="lowerLetter"/>
+      <w:lvlText w:val="%5."/>
+      <w:lvlJc w:val="left"/>
+      <w:pPr>
+        <w:ind w:left="3600" w:hanging="360"/>
+      </w:pPr>
+    </w:lvl>
+    <w:lvl w:ilvl="5" w:tplc="FFFFFFFF" w:tentative="1">
+      <w:start w:val="1"/>
+      <w:numFmt w:val="lowerRoman"/>
+      <w:lvlText w:val="%6."/>
+      <w:lvlJc w:val="right"/>
+      <w:pPr>
+        <w:ind w:left="4320" w:hanging="180"/>
+      </w:pPr>
+    </w:lvl>
+    <w:lvl w:ilvl="6" w:tplc="FFFFFFFF" w:tentative="1">
+      <w:start w:val="1"/>
+      <w:numFmt w:val="decimal"/>
+      <w:lvlText w:val="%7."/>
+      <w:lvlJc w:val="left"/>
+      <w:pPr>
+        <w:ind w:left="5040" w:hanging="360"/>
+      </w:pPr>
+    </w:lvl>
+    <w:lvl w:ilvl="7" w:tplc="FFFFFFFF" w:tentative="1">
+      <w:start w:val="1"/>
+      <w:numFmt w:val="lowerLetter"/>
+      <w:lvlText w:val="%8."/>
+      <w:lvlJc w:val="left"/>
+      <w:pPr>
+        <w:ind w:left="5760" w:hanging="360"/>
+      </w:pPr>
+    </w:lvl>
+    <w:lvl w:ilvl="8" w:tplc="FFFFFFFF" w:tentative="1">
+      <w:start w:val="1"/>
+      <w:numFmt w:val="lowerRoman"/>
+      <w:lvlText w:val="%9."/>
+      <w:lvlJc w:val="right"/>
+      <w:pPr>
+        <w:ind w:left="6480" w:hanging="180"/>
+      </w:pPr>
+    </w:lvl>
+  </w:abstractNum>
+  <w:abstractNum w:abstractNumId="7" w15:restartNumberingAfterBreak="0">
     <w:nsid w:val="455477B5"/>
     <w:multiLevelType w:val="hybridMultilevel"/>
     <w:tmpl w:val="DBA01D3C"/>
@@ -1936,7 +2919,7 @@
         <w:rFonts w:hint="default"/>
       </w:rPr>
     </w:lvl>
-    <w:lvl w:ilvl="1" w:tplc="04090019" w:tentative="1">
+    <w:lvl w:ilvl="1" w:tplc="04090019">
       <w:start w:val="1"/>
       <w:numFmt w:val="lowerLetter"/>
       <w:lvlText w:val="%2."/>
@@ -2009,7 +2992,7 @@
       </w:pPr>
     </w:lvl>
   </w:abstractNum>
-  <w:abstractNum w:abstractNumId="4" w15:restartNumberingAfterBreak="0">
+  <w:abstractNum w:abstractNumId="8" w15:restartNumberingAfterBreak="0">
     <w:nsid w:val="47473505"/>
     <w:multiLevelType w:val="hybridMultilevel"/>
     <w:tmpl w:val="2AB6F3D4"/>
@@ -2098,7 +3081,120 @@
       </w:pPr>
     </w:lvl>
   </w:abstractNum>
-  <w:abstractNum w:abstractNumId="5" w15:restartNumberingAfterBreak="0">
+  <w:abstractNum w:abstractNumId="9" w15:restartNumberingAfterBreak="0">
+    <w:nsid w:val="62DB4162"/>
+    <w:multiLevelType w:val="multilevel"/>
+    <w:tmpl w:val="1DB866EA"/>
+    <w:lvl w:ilvl="0">
+      <w:start w:val="1"/>
+      <w:numFmt w:val="decimal"/>
+      <w:lvlText w:val="%1."/>
+      <w:lvlJc w:val="left"/>
+      <w:pPr>
+        <w:tabs>
+          <w:tab w:val="num" w:pos="720"/>
+        </w:tabs>
+        <w:ind w:left="720" w:hanging="360"/>
+      </w:pPr>
+    </w:lvl>
+    <w:lvl w:ilvl="1" w:tentative="1">
+      <w:start w:val="1"/>
+      <w:numFmt w:val="decimal"/>
+      <w:lvlText w:val="%2."/>
+      <w:lvlJc w:val="left"/>
+      <w:pPr>
+        <w:tabs>
+          <w:tab w:val="num" w:pos="1440"/>
+        </w:tabs>
+        <w:ind w:left="1440" w:hanging="360"/>
+      </w:pPr>
+    </w:lvl>
+    <w:lvl w:ilvl="2" w:tentative="1">
+      <w:start w:val="1"/>
+      <w:numFmt w:val="decimal"/>
+      <w:lvlText w:val="%3."/>
+      <w:lvlJc w:val="left"/>
+      <w:pPr>
+        <w:tabs>
+          <w:tab w:val="num" w:pos="2160"/>
+        </w:tabs>
+        <w:ind w:left="2160" w:hanging="360"/>
+      </w:pPr>
+    </w:lvl>
+    <w:lvl w:ilvl="3" w:tentative="1">
+      <w:start w:val="1"/>
+      <w:numFmt w:val="decimal"/>
+      <w:lvlText w:val="%4."/>
+      <w:lvlJc w:val="left"/>
+      <w:pPr>
+        <w:tabs>
+          <w:tab w:val="num" w:pos="2880"/>
+        </w:tabs>
+        <w:ind w:left="2880" w:hanging="360"/>
+      </w:pPr>
+    </w:lvl>
+    <w:lvl w:ilvl="4" w:tentative="1">
+      <w:start w:val="1"/>
+      <w:numFmt w:val="decimal"/>
+      <w:lvlText w:val="%5."/>
+      <w:lvlJc w:val="left"/>
+      <w:pPr>
+        <w:tabs>
+          <w:tab w:val="num" w:pos="3600"/>
+        </w:tabs>
+        <w:ind w:left="3600" w:hanging="360"/>
+      </w:pPr>
+    </w:lvl>
+    <w:lvl w:ilvl="5" w:tentative="1">
+      <w:start w:val="1"/>
+      <w:numFmt w:val="decimal"/>
+      <w:lvlText w:val="%6."/>
+      <w:lvlJc w:val="left"/>
+      <w:pPr>
+        <w:tabs>
+          <w:tab w:val="num" w:pos="4320"/>
+        </w:tabs>
+        <w:ind w:left="4320" w:hanging="360"/>
+      </w:pPr>
+    </w:lvl>
+    <w:lvl w:ilvl="6" w:tentative="1">
+      <w:start w:val="1"/>
+      <w:numFmt w:val="decimal"/>
+      <w:lvlText w:val="%7."/>
+      <w:lvlJc w:val="left"/>
+      <w:pPr>
+        <w:tabs>
+          <w:tab w:val="num" w:pos="5040"/>
+        </w:tabs>
+        <w:ind w:left="5040" w:hanging="360"/>
+      </w:pPr>
+    </w:lvl>
+    <w:lvl w:ilvl="7" w:tentative="1">
+      <w:start w:val="1"/>
+      <w:numFmt w:val="decimal"/>
+      <w:lvlText w:val="%8."/>
+      <w:lvlJc w:val="left"/>
+      <w:pPr>
+        <w:tabs>
+          <w:tab w:val="num" w:pos="5760"/>
+        </w:tabs>
+        <w:ind w:left="5760" w:hanging="360"/>
+      </w:pPr>
+    </w:lvl>
+    <w:lvl w:ilvl="8" w:tentative="1">
+      <w:start w:val="1"/>
+      <w:numFmt w:val="decimal"/>
+      <w:lvlText w:val="%9."/>
+      <w:lvlJc w:val="left"/>
+      <w:pPr>
+        <w:tabs>
+          <w:tab w:val="num" w:pos="6480"/>
+        </w:tabs>
+        <w:ind w:left="6480" w:hanging="360"/>
+      </w:pPr>
+    </w:lvl>
+  </w:abstractNum>
+  <w:abstractNum w:abstractNumId="10" w15:restartNumberingAfterBreak="0">
     <w:nsid w:val="685C690A"/>
     <w:multiLevelType w:val="hybridMultilevel"/>
     <w:tmpl w:val="0F66F76C"/>
@@ -2211,7 +3307,7 @@
       </w:rPr>
     </w:lvl>
   </w:abstractNum>
-  <w:abstractNum w:abstractNumId="6" w15:restartNumberingAfterBreak="0">
+  <w:abstractNum w:abstractNumId="11" w15:restartNumberingAfterBreak="0">
     <w:nsid w:val="7C662EBD"/>
     <w:multiLevelType w:val="hybridMultilevel"/>
     <w:tmpl w:val="1F488D98"/>
@@ -2325,25 +3421,40 @@
     </w:lvl>
   </w:abstractNum>
   <w:num w:numId="1" w16cid:durableId="1332101771">
+    <w:abstractNumId w:val="8"/>
+  </w:num>
+  <w:num w:numId="2" w16cid:durableId="1369185470">
+    <w:abstractNumId w:val="7"/>
+  </w:num>
+  <w:num w:numId="3" w16cid:durableId="778181451">
+    <w:abstractNumId w:val="5"/>
+  </w:num>
+  <w:num w:numId="4" w16cid:durableId="779450479">
+    <w:abstractNumId w:val="10"/>
+  </w:num>
+  <w:num w:numId="5" w16cid:durableId="1482308948">
+    <w:abstractNumId w:val="11"/>
+  </w:num>
+  <w:num w:numId="6" w16cid:durableId="192232451">
+    <w:abstractNumId w:val="3"/>
+  </w:num>
+  <w:num w:numId="7" w16cid:durableId="1286810770">
+    <w:abstractNumId w:val="2"/>
+  </w:num>
+  <w:num w:numId="8" w16cid:durableId="684750923">
     <w:abstractNumId w:val="4"/>
   </w:num>
-  <w:num w:numId="2" w16cid:durableId="1369185470">
-    <w:abstractNumId w:val="3"/>
-  </w:num>
-  <w:num w:numId="3" w16cid:durableId="778181451">
-    <w:abstractNumId w:val="2"/>
-  </w:num>
-  <w:num w:numId="4" w16cid:durableId="779450479">
-    <w:abstractNumId w:val="5"/>
-  </w:num>
-  <w:num w:numId="5" w16cid:durableId="1482308948">
-    <w:abstractNumId w:val="6"/>
-  </w:num>
-  <w:num w:numId="6" w16cid:durableId="192232451">
+  <w:num w:numId="9" w16cid:durableId="2074355294">
     <w:abstractNumId w:val="1"/>
   </w:num>
-  <w:num w:numId="7" w16cid:durableId="1286810770">
+  <w:num w:numId="10" w16cid:durableId="1165128841">
+    <w:abstractNumId w:val="9"/>
+  </w:num>
+  <w:num w:numId="11" w16cid:durableId="1299997549">
     <w:abstractNumId w:val="0"/>
+  </w:num>
+  <w:num w:numId="12" w16cid:durableId="2053840236">
+    <w:abstractNumId w:val="6"/>
   </w:num>
 </w:numbering>
 </file>
@@ -2951,6 +4062,7 @@
   <w:style w:type="character" w:default="1" w:styleId="DefaultParagraphFont">
     <w:name w:val="Default Paragraph Font"/>
     <w:uiPriority w:val="1"/>
+    <w:semiHidden/>
     <w:unhideWhenUsed/>
   </w:style>
   <w:style w:type="table" w:default="1" w:styleId="TableNormal">
@@ -3319,6 +4431,18 @@
     <w:uiPriority w:val="99"/>
     <w:rsid w:val="00F93B5F"/>
   </w:style>
+  <w:style w:type="character" w:styleId="UnresolvedMention">
+    <w:name w:val="Unresolved Mention"/>
+    <w:basedOn w:val="DefaultParagraphFont"/>
+    <w:uiPriority w:val="99"/>
+    <w:semiHidden/>
+    <w:unhideWhenUsed/>
+    <w:rsid w:val="00636C27"/>
+    <w:rPr>
+      <w:color w:val="605E5C"/>
+      <w:shd w:val="clear" w:color="auto" w:fill="E1DFDD"/>
+    </w:rPr>
+  </w:style>
 </w:styles>
 </file>
 

</xml_diff>